<commit_message>
Remove resume name date and page-number footer
</commit_message>
<xml_diff>
--- a/assets/resume/shi-jiawen-ai-product-resume-clean-two-column-20261012.docx
+++ b/assets/resume/shi-jiawen-ai-product-resume-clean-two-column-20261012.docx
@@ -3079,7 +3079,6 @@
     </w:tbl>
     <w:sectPr>
       <w:headerReference w:type="default" r:id="rId9"/>
-      <w:footerReference w:type="default" r:id="rId20"/>
       <w:pgSz w:w="11906" w:h="16838"/>
       <w:pgMar w:top="850" w:right="850" w:bottom="850" w:left="850" w:header="0" w:footer="340" w:gutter="0"/>
       <w:cols w:space="720"/>
@@ -3087,54 +3086,6 @@
     </w:sectPr>
   </w:body>
 </w:document>
-</file>
-
-<file path=word/footer1.xml><?xml version="1.0" encoding="utf-8"?>
-<w:ftr xmlns:m="http://schemas.openxmlformats.org/officeDocument/2006/math" xmlns:mc="http://schemas.openxmlformats.org/markup-compatibility/2006" xmlns:mo="http://schemas.microsoft.com/office/mac/office/2008/main" xmlns:mv="urn:schemas-microsoft-com:mac:vml" xmlns:o="urn:schemas-microsoft-com:office:office" xmlns:r="http://schemas.openxmlformats.org/officeDocument/2006/relationships" xmlns:v="urn:schemas-microsoft-com:vml" xmlns:w10="urn:schemas-microsoft-com:office:word" xmlns:w14="http://schemas.microsoft.com/office/word/2010/wordml" xmlns:w="http://schemas.openxmlformats.org/wordprocessingml/2006/main" xmlns:wne="http://schemas.microsoft.com/office/word/2006/wordml" xmlns:wp14="http://schemas.microsoft.com/office/word/2010/wordprocessingDrawing" xmlns:wp="http://schemas.openxmlformats.org/drawingml/2006/wordprocessingDrawing" xmlns:wpc="http://schemas.microsoft.com/office/word/2010/wordprocessingCanvas" xmlns:wpg="http://schemas.microsoft.com/office/word/2010/wordprocessingGroup" xmlns:wpi="http://schemas.microsoft.com/office/word/2010/wordprocessingInk" xmlns:wps="http://schemas.microsoft.com/office/word/2010/wordprocessingShape" mc:Ignorable="w14 wp14">
-  <w:p>
-    <w:pPr>
-      <w:pStyle w:val="Footer"/>
-      <w:spacing w:after="0"/>
-      <w:jc w:val="right"/>
-    </w:pPr>
-    <w:r>
-      <w:rPr>
-        <w:rFonts w:ascii="Arial" w:hAnsi="Arial" w:eastAsia="Alibaba PuHuiTi R" w:cs="Arial"/>
-        <w:b w:val="0"/>
-        <w:i w:val="0"/>
-        <w:color w:val="66615C"/>
-        <w:sz w:val="16"/>
-      </w:rPr>
-      <w:t xml:space="preserve">师嘉文 · 2026.10.12   </w:t>
-    </w:r>
-    <w:fldSimple w:instr="PAGE">
-      <w:r>
-        <w:rPr>
-          <w:sz w:val="16"/>
-        </w:rPr>
-        <w:t>1</w:t>
-      </w:r>
-    </w:fldSimple>
-    <w:r>
-      <w:rPr>
-        <w:rFonts w:ascii="Arial" w:hAnsi="Arial" w:eastAsia="Alibaba PuHuiTi R" w:cs="Arial"/>
-        <w:b w:val="0"/>
-        <w:i w:val="0"/>
-        <w:color w:val="66615C"/>
-        <w:sz w:val="16"/>
-      </w:rPr>
-      <w:t xml:space="preserve"> / </w:t>
-    </w:r>
-    <w:fldSimple w:instr="NUMPAGES">
-      <w:r>
-        <w:rPr>
-          <w:sz w:val="16"/>
-        </w:rPr>
-        <w:t>1</w:t>
-      </w:r>
-    </w:fldSimple>
-  </w:p>
-</w:ftr>
 </file>
 
 <file path=word/header1.xml><?xml version="1.0" encoding="utf-8"?>

</xml_diff>

<commit_message>
Focus resume on product capabilities and verified delivery results
</commit_message>
<xml_diff>
--- a/assets/resume/shi-jiawen-ai-product-resume-clean-two-column-20261012.docx
+++ b/assets/resume/shi-jiawen-ai-product-resume-clean-two-column-20261012.docx
@@ -75,15 +75,6 @@
             </w:pPr>
             <w:r>
               <w:rPr>
-                <w:rFonts w:ascii="Arial" w:hAnsi="Arial" w:eastAsia="Alibaba PuHuiTi B" w:cs="Arial"/>
-                <w:b/>
-                <w:i w:val="0"/>
-                <w:color w:val="141414"/>
-                <w:sz w:val="76"/>
-              </w:rPr>
-            </w:r>
-            <w:r>
-              <w:rPr>
                 <w:rFonts w:ascii="Arial Black" w:hAnsi="Arial Black" w:eastAsia="Alibaba PuHuiTi B" w:cs="Arial Black"/>
                 <w:b/>
                 <w:i w:val="0"/>
@@ -134,7 +125,67 @@
                 <w:color w:val="141414"/>
                 <w:sz w:val="21"/>
               </w:rPr>
-              <w:t>具备大模型工作流、阶段式 Agent 与多模态生成应用的产品实践，负责业务流程梳理、范围定义、方案设计及 AI 辅助开发。能够结合业务约束与技术能力边界选择实现方式，兼顾结果质量和使用成本；具备 Bad Case 识别、错误定位、校验拦截与修正验证实践，通过人工确认和版本记录控制风险。地毯主图功能已完成付费交付并被使用。</w:t>
+              <w:t xml:space="preserve">具备需求分析、流程设计、模型选型与 AI 辅助开发能力。地毯主图工具约 </w:t>
+            </w:r>
+            <w:r>
+              <w:rPr>
+                <w:rFonts w:ascii="Arial" w:hAnsi="Arial" w:eastAsia="Alibaba PuHuiTi B" w:cs="Arial"/>
+                <w:b/>
+                <w:i w:val="0"/>
+                <w:color w:val="141414"/>
+                <w:sz w:val="21"/>
+              </w:rPr>
+              <w:t>1 个月</w:t>
+            </w:r>
+            <w:r>
+              <w:rPr>
+                <w:rFonts w:ascii="Arial" w:hAnsi="Arial" w:eastAsia="Alibaba PuHuiTi R" w:cs="Arial"/>
+                <w:b w:val="0"/>
+                <w:i w:val="0"/>
+                <w:color w:val="141414"/>
+                <w:sz w:val="21"/>
+              </w:rPr>
+              <w:t>完成开发并</w:t>
+            </w:r>
+            <w:r>
+              <w:rPr>
+                <w:rFonts w:ascii="Arial" w:hAnsi="Arial" w:eastAsia="Alibaba PuHuiTi B" w:cs="Arial"/>
+                <w:b/>
+                <w:i w:val="0"/>
+                <w:color w:val="141414"/>
+                <w:sz w:val="21"/>
+              </w:rPr>
+              <w:t>付费交付</w:t>
+            </w:r>
+            <w:r>
+              <w:rPr>
+                <w:rFonts w:ascii="Arial" w:hAnsi="Arial" w:eastAsia="Alibaba PuHuiTi R" w:cs="Arial"/>
+                <w:b w:val="0"/>
+                <w:i w:val="0"/>
+                <w:color w:val="141414"/>
+                <w:sz w:val="21"/>
+              </w:rPr>
+              <w:t xml:space="preserve">，生成与筛选约 </w:t>
+            </w:r>
+            <w:r>
+              <w:rPr>
+                <w:rFonts w:ascii="Arial" w:hAnsi="Arial" w:eastAsia="Alibaba PuHuiTi B" w:cs="Arial"/>
+                <w:b/>
+                <w:i w:val="0"/>
+                <w:color w:val="141414"/>
+                <w:sz w:val="21"/>
+              </w:rPr>
+              <w:t>5-8 分钟</w:t>
+            </w:r>
+            <w:r>
+              <w:rPr>
+                <w:rFonts w:ascii="Arial" w:hAnsi="Arial" w:eastAsia="Alibaba PuHuiTi R" w:cs="Arial"/>
+                <w:b w:val="0"/>
+                <w:i w:val="0"/>
+                <w:color w:val="141414"/>
+                <w:sz w:val="21"/>
+              </w:rPr>
+              <w:t>一套。拥有内容运营方案交付、阶段式 Agent 和异常修正实践，能结合业务约束控制质量、成本与风险。</w:t>
             </w:r>
           </w:p>
           <w:tbl>
@@ -258,15 +309,6 @@
                     <w:keepLines/>
                     <w:spacing w:before="0" w:after="40" w:line="230" w:lineRule="exact"/>
                   </w:pPr>
-                  <w:r>
-                    <w:rPr>
-                      <w:rFonts w:ascii="Arial" w:hAnsi="Arial" w:eastAsia="Alibaba PuHuiTi R" w:cs="Arial"/>
-                      <w:b w:val="0"/>
-                      <w:i w:val="0"/>
-                      <w:color w:val="141414"/>
-                      <w:sz w:val="19"/>
-                    </w:rPr>
-                  </w:r>
                   <w:hyperlink r:id="rId11">
                     <w:r>
                       <w:rPr>
@@ -284,15 +326,6 @@
                     <w:keepLines/>
                     <w:spacing w:before="0" w:after="0" w:line="230" w:lineRule="exact"/>
                   </w:pPr>
-                  <w:r>
-                    <w:rPr>
-                      <w:rFonts w:ascii="Arial" w:hAnsi="Arial" w:eastAsia="Alibaba PuHuiTi R" w:cs="Arial"/>
-                      <w:b w:val="0"/>
-                      <w:i w:val="0"/>
-                      <w:color w:val="141414"/>
-                      <w:sz w:val="19"/>
-                    </w:rPr>
-                  </w:r>
                   <w:hyperlink r:id="rId12">
                     <w:r>
                       <w:rPr>
@@ -380,15 +413,6 @@
               <w:spacing w:before="0" w:after="0" w:line="240" w:lineRule="auto"/>
             </w:pPr>
             <w:r>
-              <w:rPr>
-                <w:rFonts w:ascii="Arial" w:hAnsi="Arial" w:eastAsia="Alibaba PuHuiTi R" w:cs="Arial"/>
-                <w:b w:val="0"/>
-                <w:i w:val="0"/>
-                <w:color w:val="141414"/>
-                <w:sz w:val="2"/>
-              </w:rPr>
-            </w:r>
-            <w:r>
               <w:drawing>
                 <wp:inline xmlns:a="http://schemas.openxmlformats.org/drawingml/2006/main" xmlns:pic="http://schemas.openxmlformats.org/drawingml/2006/picture">
                   <wp:extent cx="2160000" cy="2700000"/>
@@ -400,7 +424,7 @@
                     <a:graphicData uri="http://schemas.openxmlformats.org/drawingml/2006/picture">
                       <pic:pic>
                         <pic:nvPicPr>
-                          <pic:cNvPr id="0" name="shi-jiawen-portrait-bw-20261012.png"/>
+                          <pic:cNvPr id="0" name="shi-jiawen-portrait-color-20261012.jpeg"/>
                           <pic:cNvPicPr/>
                         </pic:nvPicPr>
                         <pic:blipFill>
@@ -433,15 +457,6 @@
         <w:keepLines/>
         <w:spacing w:before="0" w:after="0" w:line="340" w:lineRule="exact"/>
       </w:pPr>
-      <w:r>
-        <w:rPr>
-          <w:rFonts w:ascii="Arial" w:hAnsi="Arial" w:eastAsia="Alibaba PuHuiTi R" w:cs="Arial"/>
-          <w:b w:val="0"/>
-          <w:i w:val="0"/>
-          <w:color w:val="141414"/>
-          <w:sz w:val="2"/>
-        </w:rPr>
-      </w:r>
     </w:p>
     <w:tbl>
       <w:tblPr>
@@ -495,15 +510,6 @@
               <w:keepLines/>
               <w:spacing w:before="0" w:after="80" w:line="340" w:lineRule="exact"/>
             </w:pPr>
-            <w:r>
-              <w:rPr>
-                <w:rFonts w:ascii="Arial" w:hAnsi="Arial" w:eastAsia="Alibaba PuHuiTi B" w:cs="Arial"/>
-                <w:b/>
-                <w:i w:val="0"/>
-                <w:color w:val="141414"/>
-                <w:sz w:val="24"/>
-              </w:rPr>
-            </w:r>
             <w:r>
               <w:rPr>
                 <w:rFonts w:ascii="Arial Black" w:hAnsi="Arial Black" w:eastAsia="Alibaba PuHuiTi B" w:cs="Arial Black"/>
@@ -574,6 +580,17 @@
                 <w:color w:val="141414"/>
                 <w:sz w:val="21"/>
               </w:rPr>
+              <w:t xml:space="preserve">•  </w:t>
+            </w:r>
+            <w:r>
+              <w:rPr>
+                <w:rFonts w:ascii="Arial" w:hAnsi="Arial" w:eastAsia="Alibaba PuHuiTi B" w:cs="Arial"/>
+                <w:b/>
+                <w:i w:val="0"/>
+                <w:color w:val="141414"/>
+                <w:sz w:val="21"/>
+              </w:rPr>
+              <w:t>需求与交付：</w:t>
             </w:r>
             <w:r>
               <w:rPr>
@@ -583,17 +600,7 @@
                 <w:color w:val="141414"/>
                 <w:sz w:val="21"/>
               </w:rPr>
-              <w:t xml:space="preserve">•  </w:t>
-            </w:r>
-            <w:r>
-              <w:rPr>
-                <w:rFonts w:ascii="Arial" w:hAnsi="Arial" w:eastAsia="Alibaba PuHuiTi R" w:cs="Arial"/>
-                <w:b w:val="0"/>
-                <w:i w:val="0"/>
-                <w:color w:val="141414"/>
-                <w:sz w:val="21"/>
-              </w:rPr>
-              <w:t>负责商业 AIGC 项目的需求沟通、制作推进、版本修改与交付；独立完成中国联通 IP 贺岁视频，负责南方基金项目从客户沟通到成片交付的全过程。</w:t>
+              <w:t>将客户需求转化为制作方案，推进生成、修改与交付；独立完成中国联通 IP 贺岁视频，负责南方基金项目从需求沟通到成片交付。</w:t>
             </w:r>
           </w:p>
           <w:p>
@@ -611,6 +618,17 @@
                 <w:color w:val="141414"/>
                 <w:sz w:val="21"/>
               </w:rPr>
+              <w:t xml:space="preserve">•  </w:t>
+            </w:r>
+            <w:r>
+              <w:rPr>
+                <w:rFonts w:ascii="Arial" w:hAnsi="Arial" w:eastAsia="Alibaba PuHuiTi B" w:cs="Arial"/>
+                <w:b/>
+                <w:i w:val="0"/>
+                <w:color w:val="141414"/>
+                <w:sz w:val="21"/>
+              </w:rPr>
+              <w:t>协作推进：</w:t>
             </w:r>
             <w:r>
               <w:rPr>
@@ -620,7 +638,17 @@
                 <w:color w:val="141414"/>
                 <w:sz w:val="21"/>
               </w:rPr>
-              <w:t xml:space="preserve">•  </w:t>
+              <w:t xml:space="preserve">牵头中国日报网《数字丝路》需求对接与制作，协调 1 位同事完成部分镜头；负责央视 AI「两弹一星」相关视频约 </w:t>
+            </w:r>
+            <w:r>
+              <w:rPr>
+                <w:rFonts w:ascii="Arial" w:hAnsi="Arial" w:eastAsia="Alibaba PuHuiTi B" w:cs="Arial"/>
+                <w:b/>
+                <w:i w:val="0"/>
+                <w:color w:val="141414"/>
+                <w:sz w:val="21"/>
+              </w:rPr>
+              <w:t>70%</w:t>
             </w:r>
             <w:r>
               <w:rPr>
@@ -630,7 +658,7 @@
                 <w:color w:val="141414"/>
                 <w:sz w:val="21"/>
               </w:rPr>
-              <w:t>牵头中国日报网《数字丝路》的需求对接与制作，协调一位同事完成部分镜头；负责央视 AI「两弹一星」相关视频约 70% 的镜头制作。</w:t>
+              <w:t xml:space="preserve"> 的镜头制作。</w:t>
             </w:r>
           </w:p>
           <w:p>
@@ -648,6 +676,17 @@
                 <w:color w:val="141414"/>
                 <w:sz w:val="21"/>
               </w:rPr>
+              <w:t xml:space="preserve">•  </w:t>
+            </w:r>
+            <w:r>
+              <w:rPr>
+                <w:rFonts w:ascii="Arial" w:hAnsi="Arial" w:eastAsia="Alibaba PuHuiTi B" w:cs="Arial"/>
+                <w:b/>
+                <w:i w:val="0"/>
+                <w:color w:val="141414"/>
+                <w:sz w:val="21"/>
+              </w:rPr>
+              <w:t>流程实践：</w:t>
             </w:r>
             <w:r>
               <w:rPr>
@@ -657,17 +696,7 @@
                 <w:color w:val="141414"/>
                 <w:sz w:val="21"/>
               </w:rPr>
-              <w:t xml:space="preserve">•  </w:t>
-            </w:r>
-            <w:r>
-              <w:rPr>
-                <w:rFonts w:ascii="Arial" w:hAnsi="Arial" w:eastAsia="Alibaba PuHuiTi R" w:cs="Arial"/>
-                <w:b w:val="0"/>
-                <w:i w:val="0"/>
-                <w:color w:val="141414"/>
-                <w:sz w:val="21"/>
-              </w:rPr>
-              <w:t>使用自建自动化脚本完成华泰证券 IP 内容制作，积累生成工具、制作流程与人工质量检查相结合的交付经验。</w:t>
+              <w:t>使用自建自动化脚本完成华泰证券 IP 内容制作，将生成工具、制作流程与人工质量检查结合。</w:t>
             </w:r>
           </w:p>
           <w:p>
@@ -676,15 +705,6 @@
               <w:keepLines/>
               <w:spacing w:before="0" w:after="0" w:line="113" w:lineRule="exact"/>
             </w:pPr>
-            <w:r>
-              <w:rPr>
-                <w:rFonts w:ascii="Arial" w:hAnsi="Arial" w:eastAsia="Alibaba PuHuiTi R" w:cs="Arial"/>
-                <w:b w:val="0"/>
-                <w:i w:val="0"/>
-                <w:color w:val="141414"/>
-                <w:sz w:val="2"/>
-              </w:rPr>
-            </w:r>
           </w:p>
           <w:p>
             <w:pPr>
@@ -735,6 +755,17 @@
                 <w:color w:val="141414"/>
                 <w:sz w:val="21"/>
               </w:rPr>
+              <w:t xml:space="preserve">•  </w:t>
+            </w:r>
+            <w:r>
+              <w:rPr>
+                <w:rFonts w:ascii="Arial" w:hAnsi="Arial" w:eastAsia="Alibaba PuHuiTi B" w:cs="Arial"/>
+                <w:b/>
+                <w:i w:val="0"/>
+                <w:color w:val="141414"/>
+                <w:sz w:val="21"/>
+              </w:rPr>
+              <w:t>电商场景：</w:t>
             </w:r>
             <w:r>
               <w:rPr>
@@ -744,17 +775,7 @@
                 <w:color w:val="141414"/>
                 <w:sz w:val="21"/>
               </w:rPr>
-              <w:t xml:space="preserve">•  </w:t>
-            </w:r>
-            <w:r>
-              <w:rPr>
-                <w:rFonts w:ascii="Arial" w:hAnsi="Arial" w:eastAsia="Alibaba PuHuiTi R" w:cs="Arial"/>
-                <w:b w:val="0"/>
-                <w:i w:val="0"/>
-                <w:color w:val="141414"/>
-                <w:sz w:val="21"/>
-              </w:rPr>
-              <w:t>从事地毯电商主图、详情页、3D 渲染及图像处理，围绕商品特征、应用场景和家居搭配制作展示素材。</w:t>
+              <w:t>负责地毯主图、详情页、3D 渲染与图像处理，围绕商品特征、应用场景及家居搭配制作展示素材。</w:t>
             </w:r>
           </w:p>
           <w:p>
@@ -772,6 +793,17 @@
                 <w:color w:val="141414"/>
                 <w:sz w:val="21"/>
               </w:rPr>
+              <w:t xml:space="preserve">•  </w:t>
+            </w:r>
+            <w:r>
+              <w:rPr>
+                <w:rFonts w:ascii="Arial" w:hAnsi="Arial" w:eastAsia="Alibaba PuHuiTi B" w:cs="Arial"/>
+                <w:b/>
+                <w:i w:val="0"/>
+                <w:color w:val="141414"/>
+                <w:sz w:val="21"/>
+              </w:rPr>
+              <w:t>流程标准：</w:t>
             </w:r>
             <w:r>
               <w:rPr>
@@ -781,17 +813,7 @@
                 <w:color w:val="141414"/>
                 <w:sz w:val="21"/>
               </w:rPr>
-              <w:t xml:space="preserve">•  </w:t>
-            </w:r>
-            <w:r>
-              <w:rPr>
-                <w:rFonts w:ascii="Arial" w:hAnsi="Arial" w:eastAsia="Alibaba PuHuiTi R" w:cs="Arial"/>
-                <w:b w:val="0"/>
-                <w:i w:val="0"/>
-                <w:color w:val="141414"/>
-                <w:sz w:val="21"/>
-              </w:rPr>
-              <w:t>梳理渲染制作流程与图片质量标准，积累天津武清地毯行业的图像生产经验；相关制作方法仍被原团队沿用。</w:t>
+              <w:t>梳理渲染制作流程与图片质量标准，形成天津武清地毯行业的图像生产方法，相关方法仍被原团队沿用。</w:t>
             </w:r>
           </w:p>
           <w:p>
@@ -800,15 +822,6 @@
               <w:keepLines/>
               <w:spacing w:before="0" w:after="0" w:line="170" w:lineRule="exact"/>
             </w:pPr>
-            <w:r>
-              <w:rPr>
-                <w:rFonts w:ascii="Arial" w:hAnsi="Arial" w:eastAsia="Alibaba PuHuiTi R" w:cs="Arial"/>
-                <w:b w:val="0"/>
-                <w:i w:val="0"/>
-                <w:color w:val="141414"/>
-                <w:sz w:val="2"/>
-              </w:rPr>
-            </w:r>
           </w:p>
           <w:p>
             <w:pPr>
@@ -816,15 +829,6 @@
               <w:keepLines/>
               <w:spacing w:before="0" w:after="80" w:line="340" w:lineRule="exact"/>
             </w:pPr>
-            <w:r>
-              <w:rPr>
-                <w:rFonts w:ascii="Arial" w:hAnsi="Arial" w:eastAsia="Alibaba PuHuiTi B" w:cs="Arial"/>
-                <w:b/>
-                <w:i w:val="0"/>
-                <w:color w:val="141414"/>
-                <w:sz w:val="24"/>
-              </w:rPr>
-            </w:r>
             <w:r>
               <w:rPr>
                 <w:rFonts w:ascii="Arial Black" w:hAnsi="Arial Black" w:eastAsia="Alibaba PuHuiTi B" w:cs="Arial Black"/>
@@ -852,15 +856,6 @@
               <w:keepLines/>
               <w:spacing w:before="0" w:after="40" w:line="320" w:lineRule="exact"/>
             </w:pPr>
-            <w:r>
-              <w:rPr>
-                <w:rFonts w:ascii="Arial" w:hAnsi="Arial" w:eastAsia="Alibaba PuHuiTi B" w:cs="Arial"/>
-                <w:b/>
-                <w:i w:val="0"/>
-                <w:color w:val="141414"/>
-                <w:sz w:val="24"/>
-              </w:rPr>
-            </w:r>
             <w:hyperlink r:id="rId14">
               <w:r>
                 <w:rPr>
@@ -904,7 +899,47 @@
                 <w:color w:val="45413D"/>
                 <w:sz w:val="19"/>
               </w:rPr>
-              <w:t>2026.05 启动，开发约一个月；主图功能已付费买断交付并使用</w:t>
+              <w:t xml:space="preserve">2026.05 启动 · 开发约 </w:t>
+            </w:r>
+            <w:r>
+              <w:rPr>
+                <w:rFonts w:ascii="Arial" w:hAnsi="Arial" w:eastAsia="Alibaba PuHuiTi B" w:cs="Arial"/>
+                <w:b/>
+                <w:i w:val="0"/>
+                <w:color w:val="45413D"/>
+                <w:sz w:val="19"/>
+              </w:rPr>
+              <w:t>1 个月</w:t>
+            </w:r>
+            <w:r>
+              <w:rPr>
+                <w:rFonts w:ascii="Arial" w:hAnsi="Arial" w:eastAsia="Alibaba PuHuiTi R" w:cs="Arial"/>
+                <w:b w:val="0"/>
+                <w:i w:val="0"/>
+                <w:color w:val="45413D"/>
+                <w:sz w:val="19"/>
+              </w:rPr>
+              <w:t xml:space="preserve"> · 主图功能已</w:t>
+            </w:r>
+            <w:r>
+              <w:rPr>
+                <w:rFonts w:ascii="Arial" w:hAnsi="Arial" w:eastAsia="Alibaba PuHuiTi B" w:cs="Arial"/>
+                <w:b/>
+                <w:i w:val="0"/>
+                <w:color w:val="45413D"/>
+                <w:sz w:val="19"/>
+              </w:rPr>
+              <w:t>付费买断交付</w:t>
+            </w:r>
+            <w:r>
+              <w:rPr>
+                <w:rFonts w:ascii="Arial" w:hAnsi="Arial" w:eastAsia="Alibaba PuHuiTi R" w:cs="Arial"/>
+                <w:b w:val="0"/>
+                <w:i w:val="0"/>
+                <w:color w:val="45413D"/>
+                <w:sz w:val="19"/>
+              </w:rPr>
+              <w:t>并使用</w:t>
             </w:r>
           </w:p>
           <w:p>
@@ -922,6 +957,17 @@
                 <w:color w:val="141414"/>
                 <w:sz w:val="21"/>
               </w:rPr>
+              <w:t xml:space="preserve">•  </w:t>
+            </w:r>
+            <w:r>
+              <w:rPr>
+                <w:rFonts w:ascii="Arial" w:hAnsi="Arial" w:eastAsia="Alibaba PuHuiTi B" w:cs="Arial"/>
+                <w:b/>
+                <w:i w:val="0"/>
+                <w:color w:val="141414"/>
+                <w:sz w:val="21"/>
+              </w:rPr>
+              <w:t>交付与效率：</w:t>
             </w:r>
             <w:r>
               <w:rPr>
@@ -931,7 +977,17 @@
                 <w:color w:val="141414"/>
                 <w:sz w:val="21"/>
               </w:rPr>
-              <w:t xml:space="preserve">•  </w:t>
+              <w:t>完成主图功能的一次性</w:t>
+            </w:r>
+            <w:r>
+              <w:rPr>
+                <w:rFonts w:ascii="Arial" w:hAnsi="Arial" w:eastAsia="Alibaba PuHuiTi B" w:cs="Arial"/>
+                <w:b/>
+                <w:i w:val="0"/>
+                <w:color w:val="141414"/>
+                <w:sz w:val="21"/>
+              </w:rPr>
+              <w:t>买断交付</w:t>
             </w:r>
             <w:r>
               <w:rPr>
@@ -941,7 +997,27 @@
                 <w:color w:val="141414"/>
                 <w:sz w:val="21"/>
               </w:rPr>
-              <w:t>梳理运营选参考、分析链接与设计师制作的原有分工，将首版范围限定为已有商品与已选参考的场景主图，让运营能够直接操作；纯原创设计继续由设计师完成。</w:t>
+              <w:t xml:space="preserve">并收款，业务方已使用；生成与筛选约 </w:t>
+            </w:r>
+            <w:r>
+              <w:rPr>
+                <w:rFonts w:ascii="Arial" w:hAnsi="Arial" w:eastAsia="Alibaba PuHuiTi B" w:cs="Arial"/>
+                <w:b/>
+                <w:i w:val="0"/>
+                <w:color w:val="141414"/>
+                <w:sz w:val="21"/>
+              </w:rPr>
+              <w:t>5-8 分钟</w:t>
+            </w:r>
+            <w:r>
+              <w:rPr>
+                <w:rFonts w:ascii="Arial" w:hAnsi="Arial" w:eastAsia="Alibaba PuHuiTi R" w:cs="Arial"/>
+                <w:b w:val="0"/>
+                <w:i w:val="0"/>
+                <w:color w:val="141414"/>
+                <w:sz w:val="21"/>
+              </w:rPr>
+              <w:t>一套，不含运营准备商品与竞品参考的时间。</w:t>
             </w:r>
           </w:p>
           <w:p>
@@ -959,6 +1035,17 @@
                 <w:color w:val="141414"/>
                 <w:sz w:val="21"/>
               </w:rPr>
+              <w:t xml:space="preserve">•  </w:t>
+            </w:r>
+            <w:r>
+              <w:rPr>
+                <w:rFonts w:ascii="Arial" w:hAnsi="Arial" w:eastAsia="Alibaba PuHuiTi B" w:cs="Arial"/>
+                <w:b/>
+                <w:i w:val="0"/>
+                <w:color w:val="141414"/>
+                <w:sz w:val="21"/>
+              </w:rPr>
+              <w:t>需求与范围：</w:t>
             </w:r>
             <w:r>
               <w:rPr>
@@ -968,17 +1055,7 @@
                 <w:color w:val="141414"/>
                 <w:sz w:val="21"/>
               </w:rPr>
-              <w:t xml:space="preserve">•  </w:t>
-            </w:r>
-            <w:r>
-              <w:rPr>
-                <w:rFonts w:ascii="Arial" w:hAnsi="Arial" w:eastAsia="Alibaba PuHuiTi R" w:cs="Arial"/>
-                <w:b w:val="0"/>
-                <w:i w:val="0"/>
-                <w:color w:val="141414"/>
-                <w:sz w:val="21"/>
-              </w:rPr>
-              <w:t>设计参考主图、自有 SKU、三角度场景比较、人工采用、商品融合和核对保存流程。使用 Image 2.0，按生成结果手动调整场景与融合提示词，分别检查构图、搭配及商品颜色、材质和图案。</w:t>
+              <w:t>梳理运营选参考、分析链接与设计师制作的分工，将首版聚焦已有商品的场景主图，让运营直接操作；纯原创设计保留给设计师。</w:t>
             </w:r>
           </w:p>
           <w:p>
@@ -996,6 +1073,17 @@
                 <w:color w:val="141414"/>
                 <w:sz w:val="21"/>
               </w:rPr>
+              <w:t xml:space="preserve">•  </w:t>
+            </w:r>
+            <w:r>
+              <w:rPr>
+                <w:rFonts w:ascii="Arial" w:hAnsi="Arial" w:eastAsia="Alibaba PuHuiTi B" w:cs="Arial"/>
+                <w:b/>
+                <w:i w:val="0"/>
+                <w:color w:val="141414"/>
+                <w:sz w:val="21"/>
+              </w:rPr>
+              <w:t>技术与质量：</w:t>
             </w:r>
             <w:r>
               <w:rPr>
@@ -1005,7 +1093,17 @@
                 <w:color w:val="141414"/>
                 <w:sz w:val="21"/>
               </w:rPr>
-              <w:t xml:space="preserve">•  </w:t>
+              <w:t xml:space="preserve">采用 Image 2.0，设计三角度场景比较、人工采用、商品融合与核对保存；按结果调整提示词，检查构图、搭配及商品颜色、材质、图案。生成调用费用参考约 </w:t>
+            </w:r>
+            <w:r>
+              <w:rPr>
+                <w:rFonts w:ascii="Arial" w:hAnsi="Arial" w:eastAsia="Alibaba PuHuiTi B" w:cs="Arial"/>
+                <w:b/>
+                <w:i w:val="0"/>
+                <w:color w:val="141414"/>
+                <w:sz w:val="21"/>
+              </w:rPr>
+              <w:t>0.5 元/次</w:t>
             </w:r>
             <w:r>
               <w:rPr>
@@ -1015,7 +1113,7 @@
                 <w:color w:val="141414"/>
                 <w:sz w:val="21"/>
               </w:rPr>
-              <w:t>负责产品方案、交互设计及前后端 AI 辅助开发。工程使用 React / TypeScript、Node.js / Fastify 与 Supabase，组织素材输入、任务状态、接口适配与结果保存。</w:t>
+              <w:t>，不含人工。</w:t>
             </w:r>
           </w:p>
           <w:p>
@@ -1033,6 +1131,17 @@
                 <w:color w:val="141414"/>
                 <w:sz w:val="21"/>
               </w:rPr>
+              <w:t xml:space="preserve">•  </w:t>
+            </w:r>
+            <w:r>
+              <w:rPr>
+                <w:rFonts w:ascii="Arial" w:hAnsi="Arial" w:eastAsia="Alibaba PuHuiTi B" w:cs="Arial"/>
+                <w:b/>
+                <w:i w:val="0"/>
+                <w:color w:val="141414"/>
+                <w:sz w:val="21"/>
+              </w:rPr>
+              <w:t>开发与验证：</w:t>
             </w:r>
             <w:r>
               <w:rPr>
@@ -1042,17 +1151,7 @@
                 <w:color w:val="141414"/>
                 <w:sz w:val="21"/>
               </w:rPr>
-              <w:t xml:space="preserve">•  </w:t>
-            </w:r>
-            <w:r>
-              <w:rPr>
-                <w:rFonts w:ascii="Arial" w:hAnsi="Arial" w:eastAsia="Alibaba PuHuiTi R" w:cs="Arial"/>
-                <w:b w:val="0"/>
-                <w:i w:val="0"/>
-                <w:color w:val="141414"/>
-                <w:sz w:val="21"/>
-              </w:rPr>
-              <w:t>主图功能向天津前老板一次性买断交付，已收款、对方已使用。本人提供的制作口径为生成与筛选约 5-8 分钟一套，不含运营提前准备商品及竞品参考的时间。</w:t>
+              <w:t>通过 Codex、Superpowers 辅助完成前后端开发，使用 React / TypeScript、Node.js / Fastify 与 Supabase，实现素材输入、任务状态、接口适配及结果保存。</w:t>
             </w:r>
           </w:p>
         </w:tc>
@@ -1115,15 +1214,6 @@
             </w:pPr>
             <w:r>
               <w:rPr>
-                <w:rFonts w:ascii="Arial" w:hAnsi="Arial" w:eastAsia="Alibaba PuHuiTi B" w:cs="Arial"/>
-                <w:b/>
-                <w:i w:val="0"/>
-                <w:color w:val="141414"/>
-                <w:sz w:val="24"/>
-              </w:rPr>
-            </w:r>
-            <w:r>
-              <w:rPr>
                 <w:rFonts w:ascii="Arial Black" w:hAnsi="Arial Black" w:eastAsia="Alibaba PuHuiTi B" w:cs="Arial Black"/>
                 <w:b/>
                 <w:i w:val="0"/>
@@ -1150,15 +1240,6 @@
               <w:spacing w:before="0" w:after="40" w:line="360" w:lineRule="exact"/>
             </w:pPr>
             <w:r>
-              <w:rPr>
-                <w:rFonts w:ascii="Arial" w:hAnsi="Arial" w:eastAsia="Alibaba PuHuiTi R" w:cs="Arial"/>
-                <w:b w:val="0"/>
-                <w:i w:val="0"/>
-                <w:color w:val="141414"/>
-                <w:sz w:val="20"/>
-              </w:rPr>
-            </w:r>
-            <w:r>
               <w:pict>
                 <v:roundrect id="SkillCapsule1" style="width:161.57pt;height:18pt;v-text-anchor:middle" arcsize="50%" strokecolor="#171717" strokeweight="0.65pt" fillcolor="#FBF8F5">
                   <v:textbox inset="4pt,1pt,4pt,0pt">
@@ -1174,7 +1255,7 @@
                             <w:sz w:val="19"/>
                             <w:b/>
                           </w:rPr>
-                          <w:t>产品分析与设计</w:t>
+                          <w:t>产品分析与验证</w:t>
                         </w:r>
                       </w:p>
                     </w:txbxContent>
@@ -1197,7 +1278,7 @@
                 <w:color w:val="141414"/>
                 <w:sz w:val="19"/>
               </w:rPr>
-              <w:t>业务流程梳理、需求拆解、范围定义、PRD、交互原型与验收条件设计；使用 Axure、XMind。</w:t>
+              <w:t>业务流程、需求拆解、范围定义、PRD、交互原型及验收条件；Axure、XMind。</w:t>
             </w:r>
           </w:p>
           <w:p>
@@ -1206,15 +1287,6 @@
               <w:keepLines/>
               <w:spacing w:before="0" w:after="0" w:line="28" w:lineRule="exact"/>
             </w:pPr>
-            <w:r>
-              <w:rPr>
-                <w:rFonts w:ascii="Arial" w:hAnsi="Arial" w:eastAsia="Alibaba PuHuiTi R" w:cs="Arial"/>
-                <w:b w:val="0"/>
-                <w:i w:val="0"/>
-                <w:color w:val="141414"/>
-                <w:sz w:val="2"/>
-              </w:rPr>
-            </w:r>
           </w:p>
           <w:p>
             <w:pPr>
@@ -1223,17 +1295,63 @@
               <w:spacing w:before="0" w:after="40" w:line="360" w:lineRule="exact"/>
             </w:pPr>
             <w:r>
+              <w:pict>
+                <v:roundrect id="SkillCapsule2" style="width:161.57pt;height:18pt;v-text-anchor:middle" arcsize="50%" strokecolor="#171717" strokeweight="0.65pt" fillcolor="#FBF8F5">
+                  <v:textbox inset="4pt,1pt,4pt,0pt">
+                    <w:txbxContent>
+                      <w:p>
+                        <w:pPr>
+                          <w:jc w:val="center"/>
+                          <w:spacing w:before="0" w:after="0" w:line="240" w:lineRule="exact"/>
+                        </w:pPr>
+                        <w:r>
+                          <w:rPr>
+                            <w:rFonts w:ascii="Arial" w:hAnsi="Arial" w:eastAsia="Alibaba PuHuiTi B"/>
+                            <w:sz w:val="19"/>
+                            <w:b/>
+                          </w:rPr>
+                          <w:t>Agent 与自动化</w:t>
+                        </w:r>
+                      </w:p>
+                    </w:txbxContent>
+                  </v:textbox>
+                </v:roundrect>
+              </w:pict>
+            </w:r>
+          </w:p>
+          <w:p>
+            <w:pPr>
+              <w:keepNext w:val="0"/>
+              <w:keepLines/>
+              <w:spacing w:before="0" w:after="80" w:line="250" w:lineRule="exact"/>
+            </w:pPr>
+            <w:r>
               <w:rPr>
                 <w:rFonts w:ascii="Arial" w:hAnsi="Arial" w:eastAsia="Alibaba PuHuiTi R" w:cs="Arial"/>
                 <w:b w:val="0"/>
                 <w:i w:val="0"/>
                 <w:color w:val="141414"/>
-                <w:sz w:val="20"/>
+                <w:sz w:val="19"/>
               </w:rPr>
+              <w:t>Agno、n8n、MCP、Agent Skills、Tool Calling；编写内容 Skill，实践微信工具与 Supabase 接入、信息采集。</w:t>
             </w:r>
+          </w:p>
+          <w:p>
+            <w:pPr>
+              <w:keepNext w:val="0"/>
+              <w:keepLines/>
+              <w:spacing w:before="0" w:after="0" w:line="28" w:lineRule="exact"/>
+            </w:pPr>
+          </w:p>
+          <w:p>
+            <w:pPr>
+              <w:keepNext/>
+              <w:keepLines/>
+              <w:spacing w:before="0" w:after="40" w:line="360" w:lineRule="exact"/>
+            </w:pPr>
             <w:r>
               <w:pict>
-                <v:roundrect id="SkillCapsule2" style="width:161.57pt;height:18pt;v-text-anchor:middle" arcsize="50%" strokecolor="#171717" strokeweight="0.65pt" fillcolor="#FBF8F5">
+                <v:roundrect id="SkillCapsule3" style="width:161.57pt;height:18pt;v-text-anchor:middle" arcsize="50%" strokecolor="#171717" strokeweight="0.65pt" fillcolor="#FBF8F5">
                   <v:textbox inset="4pt,1pt,4pt,0pt">
                     <w:txbxContent>
                       <w:p>
@@ -1270,7 +1388,7 @@
                 <w:color w:val="141414"/>
                 <w:sz w:val="19"/>
               </w:rPr>
-              <w:t>使用 Codex、Hermes、Cursor、Superpowers 辅助方案验证与前后端开发；有 API 接口对接、图像模型接入及 Supabase 使用实践。</w:t>
+              <w:t>Codex、Hermes、Cursor、Superpowers；前后端辅助开发、API 对接、图像模型接入与 Supabase 使用。</w:t>
             </w:r>
           </w:p>
           <w:p>
@@ -1279,15 +1397,6 @@
               <w:keepLines/>
               <w:spacing w:before="0" w:after="0" w:line="28" w:lineRule="exact"/>
             </w:pPr>
-            <w:r>
-              <w:rPr>
-                <w:rFonts w:ascii="Arial" w:hAnsi="Arial" w:eastAsia="Alibaba PuHuiTi R" w:cs="Arial"/>
-                <w:b w:val="0"/>
-                <w:i w:val="0"/>
-                <w:color w:val="141414"/>
-                <w:sz w:val="2"/>
-              </w:rPr>
-            </w:r>
           </w:p>
           <w:p>
             <w:pPr>
@@ -1296,17 +1405,8 @@
               <w:spacing w:before="0" w:after="40" w:line="360" w:lineRule="exact"/>
             </w:pPr>
             <w:r>
-              <w:rPr>
-                <w:rFonts w:ascii="Arial" w:hAnsi="Arial" w:eastAsia="Alibaba PuHuiTi R" w:cs="Arial"/>
-                <w:b w:val="0"/>
-                <w:i w:val="0"/>
-                <w:color w:val="141414"/>
-                <w:sz w:val="20"/>
-              </w:rPr>
-            </w:r>
-            <w:r>
               <w:pict>
-                <v:roundrect id="SkillCapsule3" style="width:161.57pt;height:18pt;v-text-anchor:middle" arcsize="50%" strokecolor="#171717" strokeweight="0.65pt" fillcolor="#FBF8F5">
+                <v:roundrect id="SkillCapsule4" style="width:161.57pt;height:18pt;v-text-anchor:middle" arcsize="50%" strokecolor="#171717" strokeweight="0.65pt" fillcolor="#FBF8F5">
                   <v:textbox inset="4pt,1pt,4pt,0pt">
                     <w:txbxContent>
                       <w:p>
@@ -1320,7 +1420,7 @@
                             <w:sz w:val="19"/>
                             <w:b/>
                           </w:rPr>
-                          <w:t>Agent 与自动化</w:t>
+                          <w:t>多模态模型应用</w:t>
                         </w:r>
                       </w:p>
                     </w:txbxContent>
@@ -1343,7 +1443,7 @@
                 <w:color w:val="141414"/>
                 <w:sz w:val="19"/>
               </w:rPr>
-              <w:t>使用 Agno、n8n、MCP、Agent Skills 与工具调用（Tool Calling）；编写内容 Skill，连接微信发布相关工具与 Supabase，使用 n8n 采集信息。</w:t>
+              <w:t>图像编辑、商品控图、数字人口播与视频制作；Image 2.0 / GPT Image、Midjourney、即梦、Seedance 2.0、海螺、Runway。</w:t>
             </w:r>
           </w:p>
           <w:p>
@@ -1352,15 +1452,6 @@
               <w:keepLines/>
               <w:spacing w:before="0" w:after="0" w:line="28" w:lineRule="exact"/>
             </w:pPr>
-            <w:r>
-              <w:rPr>
-                <w:rFonts w:ascii="Arial" w:hAnsi="Arial" w:eastAsia="Alibaba PuHuiTi R" w:cs="Arial"/>
-                <w:b w:val="0"/>
-                <w:i w:val="0"/>
-                <w:color w:val="141414"/>
-                <w:sz w:val="2"/>
-              </w:rPr>
-            </w:r>
           </w:p>
           <w:p>
             <w:pPr>
@@ -1369,17 +1460,8 @@
               <w:spacing w:before="0" w:after="40" w:line="360" w:lineRule="exact"/>
             </w:pPr>
             <w:r>
-              <w:rPr>
-                <w:rFonts w:ascii="Arial" w:hAnsi="Arial" w:eastAsia="Alibaba PuHuiTi R" w:cs="Arial"/>
-                <w:b w:val="0"/>
-                <w:i w:val="0"/>
-                <w:color w:val="141414"/>
-                <w:sz w:val="20"/>
-              </w:rPr>
-            </w:r>
-            <w:r>
               <w:pict>
-                <v:roundrect id="SkillCapsule4" style="width:161.57pt;height:18pt;v-text-anchor:middle" arcsize="50%" strokecolor="#171717" strokeweight="0.65pt" fillcolor="#FBF8F5">
+                <v:roundrect id="SkillCapsule5" style="width:161.57pt;height:18pt;v-text-anchor:middle" arcsize="50%" strokecolor="#171717" strokeweight="0.65pt" fillcolor="#FBF8F5">
                   <v:textbox inset="4pt,1pt,4pt,0pt">
                     <w:txbxContent>
                       <w:p>
@@ -1393,7 +1475,7 @@
                             <w:sz w:val="19"/>
                             <w:b/>
                           </w:rPr>
-                          <w:t>生成模型与应用</w:t>
+                          <w:t>开源与训练基础</w:t>
                         </w:r>
                       </w:p>
                     </w:txbxContent>
@@ -1416,7 +1498,7 @@
                 <w:color w:val="141414"/>
                 <w:sz w:val="19"/>
               </w:rPr>
-              <w:t>围绕图像编辑、商品控图、数字人口播与视频制作选择工具；使用过 Image 2.0 / GPT Image、Midjourney、即梦、Seedance 2.0、海螺、Runway 等。</w:t>
+              <w:t>ComfyUI / Redux 工作流、Stable Diffusion；基础了解人脸 LoRA，实践素材整理、打标与基础训练。</w:t>
             </w:r>
           </w:p>
           <w:p>
@@ -1425,15 +1507,6 @@
               <w:keepLines/>
               <w:spacing w:before="0" w:after="0" w:line="28" w:lineRule="exact"/>
             </w:pPr>
-            <w:r>
-              <w:rPr>
-                <w:rFonts w:ascii="Arial" w:hAnsi="Arial" w:eastAsia="Alibaba PuHuiTi R" w:cs="Arial"/>
-                <w:b w:val="0"/>
-                <w:i w:val="0"/>
-                <w:color w:val="141414"/>
-                <w:sz w:val="2"/>
-              </w:rPr>
-            </w:r>
           </w:p>
           <w:p>
             <w:pPr>
@@ -1441,88 +1514,6 @@
               <w:keepLines/>
               <w:spacing w:before="0" w:after="40" w:line="360" w:lineRule="exact"/>
             </w:pPr>
-            <w:r>
-              <w:rPr>
-                <w:rFonts w:ascii="Arial" w:hAnsi="Arial" w:eastAsia="Alibaba PuHuiTi R" w:cs="Arial"/>
-                <w:b w:val="0"/>
-                <w:i w:val="0"/>
-                <w:color w:val="141414"/>
-                <w:sz w:val="20"/>
-              </w:rPr>
-            </w:r>
-            <w:r>
-              <w:pict>
-                <v:roundrect id="SkillCapsule5" style="width:161.57pt;height:18pt;v-text-anchor:middle" arcsize="50%" strokecolor="#171717" strokeweight="0.65pt" fillcolor="#FBF8F5">
-                  <v:textbox inset="4pt,1pt,4pt,0pt">
-                    <w:txbxContent>
-                      <w:p>
-                        <w:pPr>
-                          <w:jc w:val="center"/>
-                          <w:spacing w:before="0" w:after="0" w:line="240" w:lineRule="exact"/>
-                        </w:pPr>
-                        <w:r>
-                          <w:rPr>
-                            <w:rFonts w:ascii="Arial" w:hAnsi="Arial" w:eastAsia="Alibaba PuHuiTi B"/>
-                            <w:sz w:val="19"/>
-                            <w:b/>
-                          </w:rPr>
-                          <w:t>开源工作流与训练实践</w:t>
-                        </w:r>
-                      </w:p>
-                    </w:txbxContent>
-                  </v:textbox>
-                </v:roundrect>
-              </w:pict>
-            </w:r>
-          </w:p>
-          <w:p>
-            <w:pPr>
-              <w:keepNext w:val="0"/>
-              <w:keepLines/>
-              <w:spacing w:before="0" w:after="80" w:line="250" w:lineRule="exact"/>
-            </w:pPr>
-            <w:r>
-              <w:rPr>
-                <w:rFonts w:ascii="Arial" w:hAnsi="Arial" w:eastAsia="Alibaba PuHuiTi R" w:cs="Arial"/>
-                <w:b w:val="0"/>
-                <w:i w:val="0"/>
-                <w:color w:val="141414"/>
-                <w:sz w:val="19"/>
-              </w:rPr>
-              <w:t>搭建过 ComfyUI / Redux 工作流，使用过 Stable Diffusion 等开源图像工具；基础了解人脸 LoRA 训练，实践过素材整理、打标与基础训练流程。</w:t>
-            </w:r>
-          </w:p>
-          <w:p>
-            <w:pPr>
-              <w:keepNext w:val="0"/>
-              <w:keepLines/>
-              <w:spacing w:before="0" w:after="0" w:line="28" w:lineRule="exact"/>
-            </w:pPr>
-            <w:r>
-              <w:rPr>
-                <w:rFonts w:ascii="Arial" w:hAnsi="Arial" w:eastAsia="Alibaba PuHuiTi R" w:cs="Arial"/>
-                <w:b w:val="0"/>
-                <w:i w:val="0"/>
-                <w:color w:val="141414"/>
-                <w:sz w:val="2"/>
-              </w:rPr>
-            </w:r>
-          </w:p>
-          <w:p>
-            <w:pPr>
-              <w:keepNext/>
-              <w:keepLines/>
-              <w:spacing w:before="0" w:after="40" w:line="360" w:lineRule="exact"/>
-            </w:pPr>
-            <w:r>
-              <w:rPr>
-                <w:rFonts w:ascii="Arial" w:hAnsi="Arial" w:eastAsia="Alibaba PuHuiTi R" w:cs="Arial"/>
-                <w:b w:val="0"/>
-                <w:i w:val="0"/>
-                <w:color w:val="141414"/>
-                <w:sz w:val="20"/>
-              </w:rPr>
-            </w:r>
             <w:r>
               <w:pict>
                 <v:roundrect id="SkillCapsule6" style="width:161.57pt;height:18pt;v-text-anchor:middle" arcsize="50%" strokecolor="#171717" strokeweight="0.65pt" fillcolor="#FBF8F5">
@@ -1562,7 +1553,7 @@
                 <w:color w:val="141414"/>
                 <w:sz w:val="19"/>
               </w:rPr>
-              <w:t>使用 Photoshop、3ds Max 制作电商图片与渲染素材；具备 Maya、Premiere Pro、After Effects 基础使用经验。使用 FFmpeg、Remotion、ElevenLabs 制作和处理视频、语音。</w:t>
+              <w:t>Photoshop、3ds Max；Maya、Premiere Pro、After Effects 基础使用。FFmpeg、Remotion、ElevenLabs 视频及语音处理。</w:t>
             </w:r>
           </w:p>
         </w:tc>
@@ -1741,15 +1732,6 @@
               <w:keepLines/>
               <w:spacing w:before="0" w:after="0" w:line="240" w:lineRule="exact"/>
             </w:pPr>
-            <w:r>
-              <w:rPr>
-                <w:rFonts w:ascii="Arial" w:hAnsi="Arial" w:eastAsia="Alibaba PuHuiTi R" w:cs="Arial"/>
-                <w:b w:val="0"/>
-                <w:i w:val="0"/>
-                <w:color w:val="141414"/>
-                <w:sz w:val="19"/>
-              </w:rPr>
-            </w:r>
             <w:hyperlink r:id="rId15">
               <w:r>
                 <w:rPr>
@@ -1770,15 +1752,6 @@
         <w:keepLines/>
         <w:spacing w:before="0" w:after="0" w:line="340" w:lineRule="exact"/>
       </w:pPr>
-      <w:r>
-        <w:rPr>
-          <w:rFonts w:ascii="Arial" w:hAnsi="Arial" w:eastAsia="Alibaba PuHuiTi R" w:cs="Arial"/>
-          <w:b w:val="0"/>
-          <w:i w:val="0"/>
-          <w:color w:val="141414"/>
-          <w:sz w:val="2"/>
-        </w:rPr>
-      </w:r>
     </w:p>
     <w:tbl>
       <w:tblPr>
@@ -1834,15 +1807,6 @@
             </w:pPr>
             <w:r>
               <w:rPr>
-                <w:rFonts w:ascii="Arial" w:hAnsi="Arial" w:eastAsia="Alibaba PuHuiTi B" w:cs="Arial"/>
-                <w:b/>
-                <w:i w:val="0"/>
-                <w:color w:val="141414"/>
-                <w:sz w:val="24"/>
-              </w:rPr>
-            </w:r>
-            <w:r>
-              <w:rPr>
                 <w:rFonts w:ascii="Arial Black" w:hAnsi="Arial Black" w:eastAsia="Alibaba PuHuiTi B" w:cs="Arial Black"/>
                 <w:b/>
                 <w:i w:val="0"/>
@@ -1868,15 +1832,6 @@
               <w:keepLines/>
               <w:spacing w:before="0" w:after="40" w:line="320" w:lineRule="exact"/>
             </w:pPr>
-            <w:r>
-              <w:rPr>
-                <w:rFonts w:ascii="Arial" w:hAnsi="Arial" w:eastAsia="Alibaba PuHuiTi B" w:cs="Arial"/>
-                <w:b/>
-                <w:i w:val="0"/>
-                <w:color w:val="141414"/>
-                <w:sz w:val="24"/>
-              </w:rPr>
-            </w:r>
             <w:hyperlink r:id="rId16">
               <w:r>
                 <w:rPr>
@@ -1920,7 +1875,7 @@
                 <w:color w:val="45413D"/>
                 <w:sz w:val="19"/>
               </w:rPr>
-              <w:t>个人工作台；持续开发</w:t>
+              <w:t>个人产品项目 · 已验证部分执行与交接机制 · 持续开发</w:t>
             </w:r>
           </w:p>
           <w:p>
@@ -1938,6 +1893,17 @@
                 <w:color w:val="141414"/>
                 <w:sz w:val="21"/>
               </w:rPr>
+              <w:t xml:space="preserve">•  </w:t>
+            </w:r>
+            <w:r>
+              <w:rPr>
+                <w:rFonts w:ascii="Arial" w:hAnsi="Arial" w:eastAsia="Alibaba PuHuiTi B" w:cs="Arial"/>
+                <w:b/>
+                <w:i w:val="0"/>
+                <w:color w:val="141414"/>
+                <w:sz w:val="21"/>
+              </w:rPr>
+              <w:t>流程定义：</w:t>
             </w:r>
             <w:r>
               <w:rPr>
@@ -1947,7 +1913,17 @@
                 <w:color w:val="141414"/>
                 <w:sz w:val="21"/>
               </w:rPr>
-              <w:t xml:space="preserve">•  </w:t>
+              <w:t xml:space="preserve">设计从问题发现到交付复盘的 </w:t>
+            </w:r>
+            <w:r>
+              <w:rPr>
+                <w:rFonts w:ascii="Arial" w:hAnsi="Arial" w:eastAsia="Alibaba PuHuiTi B" w:cs="Arial"/>
+                <w:b/>
+                <w:i w:val="0"/>
+                <w:color w:val="141414"/>
+                <w:sz w:val="21"/>
+              </w:rPr>
+              <w:t>8 阶段</w:t>
             </w:r>
             <w:r>
               <w:rPr>
@@ -1957,7 +1933,7 @@
                 <w:color w:val="141414"/>
                 <w:sz w:val="21"/>
               </w:rPr>
-              <w:t>为解决项目资料、分析与方法难以复用的问题，设计发现、定义、可行性、方案、实验、评估、交付和复盘八阶段工作台，明确各阶段的输入、产出与人工确认条件。</w:t>
+              <w:t>工作台，明确各阶段输入、产出与人工确认条件，将产品方法组织为可执行流程。</w:t>
             </w:r>
           </w:p>
           <w:p>
@@ -1975,6 +1951,17 @@
                 <w:color w:val="141414"/>
                 <w:sz w:val="21"/>
               </w:rPr>
+              <w:t xml:space="preserve">•  </w:t>
+            </w:r>
+            <w:r>
+              <w:rPr>
+                <w:rFonts w:ascii="Arial" w:hAnsi="Arial" w:eastAsia="Alibaba PuHuiTi B" w:cs="Arial"/>
+                <w:b/>
+                <w:i w:val="0"/>
+                <w:color w:val="141414"/>
+                <w:sz w:val="21"/>
+              </w:rPr>
+              <w:t>Agent 实现：</w:t>
             </w:r>
             <w:r>
               <w:rPr>
@@ -1984,17 +1971,7 @@
                 <w:color w:val="141414"/>
                 <w:sz w:val="21"/>
               </w:rPr>
-              <w:t xml:space="preserve">•  </w:t>
-            </w:r>
-            <w:r>
-              <w:rPr>
-                <w:rFonts w:ascii="Arial" w:hAnsi="Arial" w:eastAsia="Alibaba PuHuiTi R" w:cs="Arial"/>
-                <w:b w:val="0"/>
-                <w:i w:val="0"/>
-                <w:color w:val="141414"/>
-                <w:sz w:val="21"/>
-              </w:rPr>
-              <w:t>通过 AI 辅助实现资料版本、原文引用、报告确认、运行输入快照及相邻阶段交接；使用 Agno 组织阶段 Agent 执行，保存项目资料、运行记录与方法版本。</w:t>
+              <w:t>使用 Agno 组织阶段执行，通过 AI 辅助开发资料版本、原文引用、报告确认、运行输入快照及相邻阶段交接，保留执行依据。</w:t>
             </w:r>
           </w:p>
           <w:p>
@@ -2012,6 +1989,17 @@
                 <w:color w:val="141414"/>
                 <w:sz w:val="21"/>
               </w:rPr>
+              <w:t xml:space="preserve">•  </w:t>
+            </w:r>
+            <w:r>
+              <w:rPr>
+                <w:rFonts w:ascii="Arial" w:hAnsi="Arial" w:eastAsia="Alibaba PuHuiTi B" w:cs="Arial"/>
+                <w:b/>
+                <w:i w:val="0"/>
+                <w:color w:val="141414"/>
+                <w:sz w:val="21"/>
+              </w:rPr>
+              <w:t>异常验证：</w:t>
             </w:r>
             <w:r>
               <w:rPr>
@@ -2021,17 +2009,7 @@
                 <w:color w:val="141414"/>
                 <w:sz w:val="21"/>
               </w:rPr>
-              <w:t xml:space="preserve">•  </w:t>
-            </w:r>
-            <w:r>
-              <w:rPr>
-                <w:rFonts w:ascii="Arial" w:hAnsi="Arial" w:eastAsia="Alibaba PuHuiTi R" w:cs="Arial"/>
-                <w:b w:val="0"/>
-                <w:i w:val="0"/>
-                <w:color w:val="141414"/>
-                <w:sz w:val="21"/>
-              </w:rPr>
-              <w:t>在使用模拟业务材料的真实模型测试中，利用引用类型校验拦截错误结果，通过追问修正后采用并保存；将模型已生成、人工已采用和阶段已验收设为不同状态。</w:t>
+              <w:t>在模拟业务材料的真实模型测试中，识别模型把报告／交接 ID 误当成来源 ID 的问题；通过引用类型校验拦截，追问修正后采用并保存。</w:t>
             </w:r>
           </w:p>
           <w:p>
@@ -2049,6 +2027,17 @@
                 <w:color w:val="141414"/>
                 <w:sz w:val="21"/>
               </w:rPr>
+              <w:t xml:space="preserve">•  </w:t>
+            </w:r>
+            <w:r>
+              <w:rPr>
+                <w:rFonts w:ascii="Arial" w:hAnsi="Arial" w:eastAsia="Alibaba PuHuiTi B" w:cs="Arial"/>
+                <w:b/>
+                <w:i w:val="0"/>
+                <w:color w:val="141414"/>
+                <w:sz w:val="21"/>
+              </w:rPr>
+              <w:t>质量控制：</w:t>
             </w:r>
             <w:r>
               <w:rPr>
@@ -2058,7 +2047,17 @@
                 <w:color w:val="141414"/>
                 <w:sz w:val="21"/>
               </w:rPr>
-              <w:t xml:space="preserve">•  </w:t>
+              <w:t xml:space="preserve">区分模型生成、人工采用与阶段验收；上游变更后复核下游，保留草稿、确认版与历史输入。完整 </w:t>
+            </w:r>
+            <w:r>
+              <w:rPr>
+                <w:rFonts w:ascii="Arial" w:hAnsi="Arial" w:eastAsia="Alibaba PuHuiTi B" w:cs="Arial"/>
+                <w:b/>
+                <w:i w:val="0"/>
+                <w:color w:val="141414"/>
+                <w:sz w:val="21"/>
+              </w:rPr>
+              <w:t>8 阶段</w:t>
             </w:r>
             <w:r>
               <w:rPr>
@@ -2068,44 +2067,7 @@
                 <w:color w:val="141414"/>
                 <w:sz w:val="21"/>
               </w:rPr>
-              <w:t>设计上游变更后的下游复核规则，区分草稿与确认版，保留历史运行对应的输入版本。目前已验证部分执行和交接机制，完整八阶段业务项目验收仍在推进。</w:t>
-            </w:r>
-          </w:p>
-          <w:p>
-            <w:pPr>
-              <w:keepNext w:val="0"/>
-              <w:keepLines/>
-              <w:spacing w:before="0" w:after="40" w:line="280" w:lineRule="exact"/>
-              <w:ind w:left="170" w:hanging="170"/>
-            </w:pPr>
-            <w:r>
-              <w:rPr>
-                <w:rFonts w:ascii="Arial" w:hAnsi="Arial" w:eastAsia="Alibaba PuHuiTi R" w:cs="Arial"/>
-                <w:b w:val="0"/>
-                <w:i w:val="0"/>
-                <w:color w:val="141414"/>
-                <w:sz w:val="21"/>
-              </w:rPr>
-            </w:r>
-            <w:r>
-              <w:rPr>
-                <w:rFonts w:ascii="Arial" w:hAnsi="Arial" w:eastAsia="Alibaba PuHuiTi R" w:cs="Arial"/>
-                <w:b w:val="0"/>
-                <w:i w:val="0"/>
-                <w:color w:val="141414"/>
-                <w:sz w:val="21"/>
-              </w:rPr>
-              <w:t xml:space="preserve">•  </w:t>
-            </w:r>
-            <w:r>
-              <w:rPr>
-                <w:rFonts w:ascii="Arial" w:hAnsi="Arial" w:eastAsia="Alibaba PuHuiTi R" w:cs="Arial"/>
-                <w:b w:val="0"/>
-                <w:i w:val="0"/>
-                <w:color w:val="141414"/>
-                <w:sz w:val="21"/>
-              </w:rPr>
-              <w:t>实测问题：在上述模拟材料测试中，模型把报告／交接 ID 误当成来源 ID；通过类型校验拦截并追问修正。</w:t>
+              <w:t>业务验收仍在推进。</w:t>
             </w:r>
           </w:p>
           <w:p>
@@ -2114,15 +2076,6 @@
               <w:keepLines/>
               <w:spacing w:before="0" w:after="0" w:line="283" w:lineRule="exact"/>
             </w:pPr>
-            <w:r>
-              <w:rPr>
-                <w:rFonts w:ascii="Arial" w:hAnsi="Arial" w:eastAsia="Alibaba PuHuiTi R" w:cs="Arial"/>
-                <w:b w:val="0"/>
-                <w:i w:val="0"/>
-                <w:color w:val="141414"/>
-                <w:sz w:val="2"/>
-              </w:rPr>
-            </w:r>
           </w:p>
           <w:p>
             <w:pPr>
@@ -2130,15 +2083,6 @@
               <w:keepLines/>
               <w:spacing w:before="0" w:after="80" w:line="340" w:lineRule="exact"/>
             </w:pPr>
-            <w:r>
-              <w:rPr>
-                <w:rFonts w:ascii="Arial" w:hAnsi="Arial" w:eastAsia="Alibaba PuHuiTi B" w:cs="Arial"/>
-                <w:b/>
-                <w:i w:val="0"/>
-                <w:color w:val="141414"/>
-                <w:sz w:val="24"/>
-              </w:rPr>
-            </w:r>
             <w:r>
               <w:rPr>
                 <w:rFonts w:ascii="Arial Black" w:hAnsi="Arial Black" w:eastAsia="Alibaba PuHuiTi B" w:cs="Arial Black"/>
@@ -2166,15 +2110,6 @@
               <w:keepLines/>
               <w:spacing w:before="0" w:after="40" w:line="320" w:lineRule="exact"/>
             </w:pPr>
-            <w:r>
-              <w:rPr>
-                <w:rFonts w:ascii="Arial" w:hAnsi="Arial" w:eastAsia="Alibaba PuHuiTi B" w:cs="Arial"/>
-                <w:b/>
-                <w:i w:val="0"/>
-                <w:color w:val="141414"/>
-                <w:sz w:val="24"/>
-              </w:rPr>
-            </w:r>
             <w:hyperlink r:id="rId17">
               <w:r>
                 <w:rPr>
@@ -2218,7 +2153,7 @@
                 <w:color w:val="45413D"/>
                 <w:sz w:val="19"/>
               </w:rPr>
-              <w:t>业务方案已交付；独立平台持续开发</w:t>
+              <w:t>业务方案已交付，业务方自行开发 · 独立平台持续开发</w:t>
             </w:r>
           </w:p>
           <w:p>
@@ -2236,6 +2171,17 @@
                 <w:color w:val="141414"/>
                 <w:sz w:val="21"/>
               </w:rPr>
+              <w:t xml:space="preserve">•  </w:t>
+            </w:r>
+            <w:r>
+              <w:rPr>
+                <w:rFonts w:ascii="Arial" w:hAnsi="Arial" w:eastAsia="Alibaba PuHuiTi B" w:cs="Arial"/>
+                <w:b/>
+                <w:i w:val="0"/>
+                <w:color w:val="141414"/>
+                <w:sz w:val="21"/>
+              </w:rPr>
+              <w:t>方案交付：</w:t>
             </w:r>
             <w:r>
               <w:rPr>
@@ -2245,17 +2191,7 @@
                 <w:color w:val="141414"/>
                 <w:sz w:val="21"/>
               </w:rPr>
-              <w:t xml:space="preserve">•  </w:t>
-            </w:r>
-            <w:r>
-              <w:rPr>
-                <w:rFonts w:ascii="Arial" w:hAnsi="Arial" w:eastAsia="Alibaba PuHuiTi R" w:cs="Arial"/>
-                <w:b w:val="0"/>
-                <w:i w:val="0"/>
-                <w:color w:val="141414"/>
-                <w:sz w:val="21"/>
-              </w:rPr>
-              <w:t>从留学与移民业务团队的内容效率问题出发，梳理账号分层、人设、选题、草稿审核与反馈流程，交付业务方案，由业务方自行开发。围绕同类需求独立构建内容工作台，并沉淀内容 Skill。</w:t>
+              <w:t>针对留学与移民团队的内容效率需求，梳理账号分层、人设、选题、审核与反馈，完成业务方案交付，由业务方自行开发。</w:t>
             </w:r>
           </w:p>
           <w:p>
@@ -2273,6 +2209,17 @@
                 <w:color w:val="141414"/>
                 <w:sz w:val="21"/>
               </w:rPr>
+              <w:t xml:space="preserve">•  </w:t>
+            </w:r>
+            <w:r>
+              <w:rPr>
+                <w:rFonts w:ascii="Arial" w:hAnsi="Arial" w:eastAsia="Alibaba PuHuiTi B" w:cs="Arial"/>
+                <w:b/>
+                <w:i w:val="0"/>
+                <w:color w:val="141414"/>
+                <w:sz w:val="21"/>
+              </w:rPr>
+              <w:t>产品实现：</w:t>
             </w:r>
             <w:r>
               <w:rPr>
@@ -2282,17 +2229,7 @@
                 <w:color w:val="141414"/>
                 <w:sz w:val="21"/>
               </w:rPr>
-              <w:t xml:space="preserve">•  </w:t>
-            </w:r>
-            <w:r>
-              <w:rPr>
-                <w:rFonts w:ascii="Arial" w:hAnsi="Arial" w:eastAsia="Alibaba PuHuiTi R" w:cs="Arial"/>
-                <w:b w:val="0"/>
-                <w:i w:val="0"/>
-                <w:color w:val="141414"/>
-                <w:sz w:val="21"/>
-              </w:rPr>
-              <w:t>针对自动发布容易触发平台风控的问题，取消自动发布，保留人工发布与登记；策略调整先形成建议，经人工确认后更新 SOP。</w:t>
+              <w:t>围绕同类需求独立构建内容工作台，沉淀内容 Skill；本地运行覆盖参考采集到待审核草稿，保留来源引用与任务状态。</w:t>
             </w:r>
           </w:p>
           <w:p>
@@ -2310,7 +2247,36 @@
                 <w:color w:val="141414"/>
                 <w:sz w:val="21"/>
               </w:rPr>
+              <w:t xml:space="preserve">•  </w:t>
             </w:r>
+            <w:r>
+              <w:rPr>
+                <w:rFonts w:ascii="Arial" w:hAnsi="Arial" w:eastAsia="Alibaba PuHuiTi B" w:cs="Arial"/>
+                <w:b/>
+                <w:i w:val="0"/>
+                <w:color w:val="141414"/>
+                <w:sz w:val="21"/>
+              </w:rPr>
+              <w:t>风险取舍：</w:t>
+            </w:r>
+            <w:r>
+              <w:rPr>
+                <w:rFonts w:ascii="Arial" w:hAnsi="Arial" w:eastAsia="Alibaba PuHuiTi R" w:cs="Arial"/>
+                <w:b w:val="0"/>
+                <w:i w:val="0"/>
+                <w:color w:val="141414"/>
+                <w:sz w:val="21"/>
+              </w:rPr>
+              <w:t>针对自动发布触发平台风控的问题，取消自动发布，保留人工发布与登记；策略建议经人工确认后更新 SOP。</w:t>
+            </w:r>
+          </w:p>
+          <w:p>
+            <w:pPr>
+              <w:keepNext w:val="0"/>
+              <w:keepLines/>
+              <w:spacing w:before="0" w:after="40" w:line="280" w:lineRule="exact"/>
+              <w:ind w:left="170" w:hanging="170"/>
+            </w:pPr>
             <w:r>
               <w:rPr>
                 <w:rFonts w:ascii="Arial" w:hAnsi="Arial" w:eastAsia="Alibaba PuHuiTi R" w:cs="Arial"/>
@@ -2323,13 +2289,23 @@
             </w:r>
             <w:r>
               <w:rPr>
+                <w:rFonts w:ascii="Arial" w:hAnsi="Arial" w:eastAsia="Alibaba PuHuiTi B" w:cs="Arial"/>
+                <w:b/>
+                <w:i w:val="0"/>
+                <w:color w:val="141414"/>
+                <w:sz w:val="21"/>
+              </w:rPr>
+              <w:t>异常处理：</w:t>
+            </w:r>
+            <w:r>
+              <w:rPr>
                 <w:rFonts w:ascii="Arial" w:hAnsi="Arial" w:eastAsia="Alibaba PuHuiTi R" w:cs="Arial"/>
                 <w:b w:val="0"/>
                 <w:i w:val="0"/>
                 <w:color w:val="141414"/>
                 <w:sz w:val="21"/>
               </w:rPr>
-              <w:t>本地运行已覆盖参考采集到待审核草稿，保留来源引用和任务状态；通过重复任务复用、已有素材保留及局部重试，处理重复操作和采集失败。真实发布到反馈的完整链路仍在验证。</w:t>
+              <w:t>支持重复任务复用、已有素材保留及局部重试，处理重复操作与采集失败；真实发布到反馈的完整链路仍在验证。</w:t>
             </w:r>
           </w:p>
           <w:p>
@@ -2338,15 +2314,6 @@
               <w:keepLines/>
               <w:spacing w:before="0" w:after="0" w:line="283" w:lineRule="exact"/>
             </w:pPr>
-            <w:r>
-              <w:rPr>
-                <w:rFonts w:ascii="Arial" w:hAnsi="Arial" w:eastAsia="Alibaba PuHuiTi R" w:cs="Arial"/>
-                <w:b w:val="0"/>
-                <w:i w:val="0"/>
-                <w:color w:val="141414"/>
-                <w:sz w:val="2"/>
-              </w:rPr>
-            </w:r>
           </w:p>
           <w:p>
             <w:pPr>
@@ -2354,15 +2321,6 @@
               <w:keepLines/>
               <w:spacing w:before="0" w:after="80" w:line="340" w:lineRule="exact"/>
             </w:pPr>
-            <w:r>
-              <w:rPr>
-                <w:rFonts w:ascii="Arial" w:hAnsi="Arial" w:eastAsia="Alibaba PuHuiTi B" w:cs="Arial"/>
-                <w:b/>
-                <w:i w:val="0"/>
-                <w:color w:val="141414"/>
-                <w:sz w:val="24"/>
-              </w:rPr>
-            </w:r>
             <w:r>
               <w:rPr>
                 <w:rFonts w:ascii="Arial Black" w:hAnsi="Arial Black" w:eastAsia="Alibaba PuHuiTi B" w:cs="Arial Black"/>
@@ -2390,15 +2348,6 @@
               <w:keepLines/>
               <w:spacing w:before="0" w:after="60" w:line="300" w:lineRule="exact"/>
             </w:pPr>
-            <w:r>
-              <w:rPr>
-                <w:rFonts w:ascii="Arial" w:hAnsi="Arial" w:eastAsia="Alibaba PuHuiTi B" w:cs="Arial"/>
-                <w:b/>
-                <w:i w:val="0"/>
-                <w:color w:val="141414"/>
-                <w:sz w:val="22"/>
-              </w:rPr>
-            </w:r>
             <w:hyperlink r:id="rId18">
               <w:r>
                 <w:rPr>
@@ -2425,7 +2374,7 @@
                 <w:color w:val="141414"/>
                 <w:sz w:val="21"/>
               </w:rPr>
-              <w:t>承接律师使用 Excel 加人工审核流水的真实需求，负责业务流程、整体方案及前端原型，参与识别字段与审核逻辑的研发对接。原型交给合作朋友展示，后续客户取消需求，项目未落地。</w:t>
+              <w:t>业务流程与原型：梳理律师使用 Excel 加人工审核流水的需求，负责整体方案、前端原型与字段识别的研发对接。原型已展示；客户取消需求，未落地。</w:t>
             </w:r>
           </w:p>
           <w:p>
@@ -2434,15 +2383,6 @@
               <w:keepLines/>
               <w:spacing w:before="0" w:after="0" w:line="113" w:lineRule="exact"/>
             </w:pPr>
-            <w:r>
-              <w:rPr>
-                <w:rFonts w:ascii="Arial" w:hAnsi="Arial" w:eastAsia="Alibaba PuHuiTi R" w:cs="Arial"/>
-                <w:b w:val="0"/>
-                <w:i w:val="0"/>
-                <w:color w:val="141414"/>
-                <w:sz w:val="2"/>
-              </w:rPr>
-            </w:r>
           </w:p>
           <w:p>
             <w:pPr>
@@ -2450,15 +2390,6 @@
               <w:keepLines/>
               <w:spacing w:before="0" w:after="60" w:line="300" w:lineRule="exact"/>
             </w:pPr>
-            <w:r>
-              <w:rPr>
-                <w:rFonts w:ascii="Arial" w:hAnsi="Arial" w:eastAsia="Alibaba PuHuiTi B" w:cs="Arial"/>
-                <w:b/>
-                <w:i w:val="0"/>
-                <w:color w:val="141414"/>
-                <w:sz w:val="22"/>
-              </w:rPr>
-            </w:r>
             <w:hyperlink r:id="rId19">
               <w:r>
                 <w:rPr>
@@ -2485,7 +2416,27 @@
                 <w:color w:val="141414"/>
                 <w:sz w:val="21"/>
               </w:rPr>
-              <w:t>通过私董会负责人对接两家北京商家，进行线下需求接触，整理经营看板、营销准备和客户回访流程，完成方案与交互原型阶段的交付。</w:t>
+              <w:t xml:space="preserve">需求接触与方案：对接 </w:t>
+            </w:r>
+            <w:r>
+              <w:rPr>
+                <w:rFonts w:ascii="Arial" w:hAnsi="Arial" w:eastAsia="Alibaba PuHuiTi B" w:cs="Arial"/>
+                <w:b/>
+                <w:i w:val="0"/>
+                <w:color w:val="141414"/>
+                <w:sz w:val="21"/>
+              </w:rPr>
+              <w:t>2 家</w:t>
+            </w:r>
+            <w:r>
+              <w:rPr>
+                <w:rFonts w:ascii="Arial" w:hAnsi="Arial" w:eastAsia="Alibaba PuHuiTi R" w:cs="Arial"/>
+                <w:b w:val="0"/>
+                <w:i w:val="0"/>
+                <w:color w:val="141414"/>
+                <w:sz w:val="21"/>
+              </w:rPr>
+              <w:t>北京商家并进行线下需求接触，整理经营看板、营销准备与回访流程，交付方案和交互原型。</w:t>
             </w:r>
           </w:p>
         </w:tc>
@@ -2546,15 +2497,6 @@
               <w:keepLines/>
               <w:spacing w:before="0" w:after="80" w:line="340" w:lineRule="exact"/>
             </w:pPr>
-            <w:r>
-              <w:rPr>
-                <w:rFonts w:ascii="Arial" w:hAnsi="Arial" w:eastAsia="Alibaba PuHuiTi B" w:cs="Arial"/>
-                <w:b/>
-                <w:i w:val="0"/>
-                <w:color w:val="141414"/>
-                <w:sz w:val="24"/>
-              </w:rPr>
-            </w:r>
             <w:r>
               <w:rPr>
                 <w:rFonts w:ascii="Arial Black" w:hAnsi="Arial Black" w:eastAsia="Alibaba PuHuiTi B" w:cs="Arial Black"/>
@@ -2626,7 +2568,7 @@
                 <w:color w:val="141414"/>
                 <w:sz w:val="20"/>
               </w:rPr>
-              <w:t>院学生会副主席；RT 舞社 Breaking 社长。参与组织校园活动与社团训练、演出。</w:t>
+              <w:t>院学生会副主席；RT 舞社 Breaking 社长，组织校园活动、社团训练与演出。</w:t>
             </w:r>
           </w:p>
           <w:p>
@@ -2635,15 +2577,6 @@
               <w:keepLines/>
               <w:spacing w:before="0" w:after="0" w:line="397" w:lineRule="exact"/>
             </w:pPr>
-            <w:r>
-              <w:rPr>
-                <w:rFonts w:ascii="Arial" w:hAnsi="Arial" w:eastAsia="Alibaba PuHuiTi R" w:cs="Arial"/>
-                <w:b w:val="0"/>
-                <w:i w:val="0"/>
-                <w:color w:val="141414"/>
-                <w:sz w:val="2"/>
-              </w:rPr>
-            </w:r>
           </w:p>
           <w:p>
             <w:pPr>
@@ -2651,15 +2584,6 @@
               <w:keepLines/>
               <w:spacing w:before="0" w:after="80" w:line="340" w:lineRule="exact"/>
             </w:pPr>
-            <w:r>
-              <w:rPr>
-                <w:rFonts w:ascii="Arial" w:hAnsi="Arial" w:eastAsia="Alibaba PuHuiTi B" w:cs="Arial"/>
-                <w:b/>
-                <w:i w:val="0"/>
-                <w:color w:val="141414"/>
-                <w:sz w:val="24"/>
-              </w:rPr>
-            </w:r>
             <w:r>
               <w:rPr>
                 <w:rFonts w:ascii="Arial Black" w:hAnsi="Arial Black" w:eastAsia="Alibaba PuHuiTi B" w:cs="Arial Black"/>
@@ -2891,15 +2815,6 @@
               <w:keepLines/>
               <w:spacing w:before="0" w:after="0" w:line="170" w:lineRule="exact"/>
             </w:pPr>
-            <w:r>
-              <w:rPr>
-                <w:rFonts w:ascii="Arial" w:hAnsi="Arial" w:eastAsia="Alibaba PuHuiTi R" w:cs="Arial"/>
-                <w:b w:val="0"/>
-                <w:i w:val="0"/>
-                <w:color w:val="141414"/>
-                <w:sz w:val="2"/>
-              </w:rPr>
-            </w:r>
           </w:p>
           <w:p>
             <w:pPr>
@@ -2907,15 +2822,6 @@
               <w:keepLines/>
               <w:spacing w:before="0" w:after="80" w:line="340" w:lineRule="exact"/>
             </w:pPr>
-            <w:r>
-              <w:rPr>
-                <w:rFonts w:ascii="Arial" w:hAnsi="Arial" w:eastAsia="Alibaba PuHuiTi B" w:cs="Arial"/>
-                <w:b/>
-                <w:i w:val="0"/>
-                <w:color w:val="141414"/>
-                <w:sz w:val="24"/>
-              </w:rPr>
-            </w:r>
             <w:r>
               <w:rPr>
                 <w:rFonts w:ascii="Arial Black" w:hAnsi="Arial Black" w:eastAsia="Alibaba PuHuiTi B" w:cs="Arial Black"/>
@@ -2985,7 +2891,47 @@
                 <w:color w:val="141414"/>
                 <w:sz w:val="20"/>
               </w:rPr>
-              <w:t>组织约 200 人的线下交流社群，已开展近 20 场主题活动，围绕 AI Native、Agent、知识库与业务场景交流。</w:t>
+              <w:t xml:space="preserve">组织约 </w:t>
+            </w:r>
+            <w:r>
+              <w:rPr>
+                <w:rFonts w:ascii="Arial" w:hAnsi="Arial" w:eastAsia="Alibaba PuHuiTi B" w:cs="Arial"/>
+                <w:b/>
+                <w:i w:val="0"/>
+                <w:color w:val="141414"/>
+                <w:sz w:val="20"/>
+              </w:rPr>
+              <w:t>200 人</w:t>
+            </w:r>
+            <w:r>
+              <w:rPr>
+                <w:rFonts w:ascii="Arial" w:hAnsi="Arial" w:eastAsia="Alibaba PuHuiTi R" w:cs="Arial"/>
+                <w:b w:val="0"/>
+                <w:i w:val="0"/>
+                <w:color w:val="141414"/>
+                <w:sz w:val="20"/>
+              </w:rPr>
+              <w:t xml:space="preserve">的线下交流社群，开展近 </w:t>
+            </w:r>
+            <w:r>
+              <w:rPr>
+                <w:rFonts w:ascii="Arial" w:hAnsi="Arial" w:eastAsia="Alibaba PuHuiTi B" w:cs="Arial"/>
+                <w:b/>
+                <w:i w:val="0"/>
+                <w:color w:val="141414"/>
+                <w:sz w:val="20"/>
+              </w:rPr>
+              <w:t>20 场</w:t>
+            </w:r>
+            <w:r>
+              <w:rPr>
+                <w:rFonts w:ascii="Arial" w:hAnsi="Arial" w:eastAsia="Alibaba PuHuiTi R" w:cs="Arial"/>
+                <w:b w:val="0"/>
+                <w:i w:val="0"/>
+                <w:color w:val="141414"/>
+                <w:sz w:val="20"/>
+              </w:rPr>
+              <w:t>主题活动，围绕 AI Native、Agent、知识库与业务场景交流。</w:t>
             </w:r>
           </w:p>
           <w:p>
@@ -3002,7 +2948,7 @@
                 <w:color w:val="141414"/>
                 <w:sz w:val="20"/>
               </w:rPr>
-              <w:t>组织成员参与 AI 黑客松，通过线下交流接触不同领域的从业者，积累业务需求线索与合作机会。</w:t>
+              <w:t>组织成员参与 AI 黑客松，对接不同领域从业者，积累业务需求线索与合作机会。</w:t>
             </w:r>
           </w:p>
           <w:p>
@@ -3011,15 +2957,6 @@
               <w:keepLines/>
               <w:spacing w:before="0" w:after="0" w:line="227" w:lineRule="exact"/>
             </w:pPr>
-            <w:r>
-              <w:rPr>
-                <w:rFonts w:ascii="Arial" w:hAnsi="Arial" w:eastAsia="Alibaba PuHuiTi R" w:cs="Arial"/>
-                <w:b w:val="0"/>
-                <w:i w:val="0"/>
-                <w:color w:val="141414"/>
-                <w:sz w:val="2"/>
-              </w:rPr>
-            </w:r>
           </w:p>
           <w:p>
             <w:pPr>
@@ -3027,15 +2964,6 @@
               <w:keepLines/>
               <w:spacing w:before="0" w:after="80" w:line="340" w:lineRule="exact"/>
             </w:pPr>
-            <w:r>
-              <w:rPr>
-                <w:rFonts w:ascii="Arial" w:hAnsi="Arial" w:eastAsia="Alibaba PuHuiTi B" w:cs="Arial"/>
-                <w:b/>
-                <w:i w:val="0"/>
-                <w:color w:val="141414"/>
-                <w:sz w:val="24"/>
-              </w:rPr>
-            </w:r>
             <w:r>
               <w:rPr>
                 <w:rFonts w:ascii="Arial Black" w:hAnsi="Arial Black" w:eastAsia="Alibaba PuHuiTi B" w:cs="Arial Black"/>

</xml_diff>

<commit_message>
Show product projects before employment in resume
</commit_message>
<xml_diff>
--- a/assets/resume/shi-jiawen-ai-product-resume-clean-two-column-20261012.docx
+++ b/assets/resume/shi-jiawen-ai-product-resume-clean-two-column-20261012.docx
@@ -518,325 +518,6 @@
                 <w:color w:val="000000"/>
                 <w:sz w:val="23"/>
               </w:rPr>
-              <w:t>EXPERIENCE</w:t>
-            </w:r>
-            <w:r>
-              <w:rPr>
-                <w:rFonts w:ascii="Arial" w:hAnsi="Arial" w:eastAsia="Alibaba PuHuiTi B" w:cs="Arial"/>
-                <w:b/>
-                <w:i w:val="0"/>
-                <w:color w:val="000000"/>
-                <w:sz w:val="21"/>
-              </w:rPr>
-              <w:t xml:space="preserve">  /  工作经历</w:t>
-            </w:r>
-          </w:p>
-          <w:p>
-            <w:pPr>
-              <w:keepNext/>
-              <w:keepLines/>
-              <w:spacing w:before="0" w:after="40" w:line="300" w:lineRule="exact"/>
-            </w:pPr>
-            <w:r>
-              <w:rPr>
-                <w:rFonts w:ascii="Arial" w:hAnsi="Arial" w:eastAsia="Alibaba PuHuiTi B" w:cs="Arial"/>
-                <w:b/>
-                <w:i w:val="0"/>
-                <w:color w:val="141414"/>
-                <w:sz w:val="22"/>
-              </w:rPr>
-              <w:t>中科趋势 · AIGC 设计师</w:t>
-            </w:r>
-          </w:p>
-          <w:p>
-            <w:pPr>
-              <w:keepNext/>
-              <w:keepLines/>
-              <w:spacing w:before="0" w:after="80" w:line="240" w:lineRule="exact"/>
-            </w:pPr>
-            <w:r>
-              <w:rPr>
-                <w:rFonts w:ascii="Arial" w:hAnsi="Arial" w:eastAsia="Alibaba PuHuiTi R" w:cs="Arial"/>
-                <w:b w:val="0"/>
-                <w:i w:val="0"/>
-                <w:color w:val="45413D"/>
-                <w:sz w:val="19"/>
-              </w:rPr>
-              <w:t>2024.03 - 至今</w:t>
-            </w:r>
-          </w:p>
-          <w:p>
-            <w:pPr>
-              <w:keepNext w:val="0"/>
-              <w:keepLines/>
-              <w:spacing w:before="0" w:after="40" w:line="270" w:lineRule="exact"/>
-              <w:ind w:left="170" w:hanging="170"/>
-            </w:pPr>
-            <w:r>
-              <w:rPr>
-                <w:rFonts w:ascii="Arial" w:hAnsi="Arial" w:eastAsia="Alibaba PuHuiTi R" w:cs="Arial"/>
-                <w:b w:val="0"/>
-                <w:i w:val="0"/>
-                <w:color w:val="141414"/>
-                <w:sz w:val="21"/>
-              </w:rPr>
-              <w:t xml:space="preserve">•  </w:t>
-            </w:r>
-            <w:r>
-              <w:rPr>
-                <w:rFonts w:ascii="Arial" w:hAnsi="Arial" w:eastAsia="Alibaba PuHuiTi B" w:cs="Arial"/>
-                <w:b/>
-                <w:i w:val="0"/>
-                <w:color w:val="141414"/>
-                <w:sz w:val="21"/>
-              </w:rPr>
-              <w:t>需求与交付：</w:t>
-            </w:r>
-            <w:r>
-              <w:rPr>
-                <w:rFonts w:ascii="Arial" w:hAnsi="Arial" w:eastAsia="Alibaba PuHuiTi R" w:cs="Arial"/>
-                <w:b w:val="0"/>
-                <w:i w:val="0"/>
-                <w:color w:val="141414"/>
-                <w:sz w:val="21"/>
-              </w:rPr>
-              <w:t>将客户需求转化为制作方案，推进生成、修改与交付；独立完成中国联通 IP 贺岁视频，负责南方基金项目从需求沟通到成片交付。</w:t>
-            </w:r>
-          </w:p>
-          <w:p>
-            <w:pPr>
-              <w:keepNext w:val="0"/>
-              <w:keepLines/>
-              <w:spacing w:before="0" w:after="40" w:line="270" w:lineRule="exact"/>
-              <w:ind w:left="170" w:hanging="170"/>
-            </w:pPr>
-            <w:r>
-              <w:rPr>
-                <w:rFonts w:ascii="Arial" w:hAnsi="Arial" w:eastAsia="Alibaba PuHuiTi R" w:cs="Arial"/>
-                <w:b w:val="0"/>
-                <w:i w:val="0"/>
-                <w:color w:val="141414"/>
-                <w:sz w:val="21"/>
-              </w:rPr>
-              <w:t xml:space="preserve">•  </w:t>
-            </w:r>
-            <w:r>
-              <w:rPr>
-                <w:rFonts w:ascii="Arial" w:hAnsi="Arial" w:eastAsia="Alibaba PuHuiTi B" w:cs="Arial"/>
-                <w:b/>
-                <w:i w:val="0"/>
-                <w:color w:val="141414"/>
-                <w:sz w:val="21"/>
-              </w:rPr>
-              <w:t>协作推进：</w:t>
-            </w:r>
-            <w:r>
-              <w:rPr>
-                <w:rFonts w:ascii="Arial" w:hAnsi="Arial" w:eastAsia="Alibaba PuHuiTi R" w:cs="Arial"/>
-                <w:b w:val="0"/>
-                <w:i w:val="0"/>
-                <w:color w:val="141414"/>
-                <w:sz w:val="21"/>
-              </w:rPr>
-              <w:t xml:space="preserve">牵头中国日报网《数字丝路》需求对接与制作，协调 1 位同事完成部分镜头；负责央视 AI「两弹一星」相关视频约 </w:t>
-            </w:r>
-            <w:r>
-              <w:rPr>
-                <w:rFonts w:ascii="Arial" w:hAnsi="Arial" w:eastAsia="Alibaba PuHuiTi B" w:cs="Arial"/>
-                <w:b/>
-                <w:i w:val="0"/>
-                <w:color w:val="141414"/>
-                <w:sz w:val="21"/>
-              </w:rPr>
-              <w:t>70%</w:t>
-            </w:r>
-            <w:r>
-              <w:rPr>
-                <w:rFonts w:ascii="Arial" w:hAnsi="Arial" w:eastAsia="Alibaba PuHuiTi R" w:cs="Arial"/>
-                <w:b w:val="0"/>
-                <w:i w:val="0"/>
-                <w:color w:val="141414"/>
-                <w:sz w:val="21"/>
-              </w:rPr>
-              <w:t xml:space="preserve"> 的镜头制作。</w:t>
-            </w:r>
-          </w:p>
-          <w:p>
-            <w:pPr>
-              <w:keepNext w:val="0"/>
-              <w:keepLines/>
-              <w:spacing w:before="0" w:after="40" w:line="270" w:lineRule="exact"/>
-              <w:ind w:left="170" w:hanging="170"/>
-            </w:pPr>
-            <w:r>
-              <w:rPr>
-                <w:rFonts w:ascii="Arial" w:hAnsi="Arial" w:eastAsia="Alibaba PuHuiTi R" w:cs="Arial"/>
-                <w:b w:val="0"/>
-                <w:i w:val="0"/>
-                <w:color w:val="141414"/>
-                <w:sz w:val="21"/>
-              </w:rPr>
-              <w:t xml:space="preserve">•  </w:t>
-            </w:r>
-            <w:r>
-              <w:rPr>
-                <w:rFonts w:ascii="Arial" w:hAnsi="Arial" w:eastAsia="Alibaba PuHuiTi B" w:cs="Arial"/>
-                <w:b/>
-                <w:i w:val="0"/>
-                <w:color w:val="141414"/>
-                <w:sz w:val="21"/>
-              </w:rPr>
-              <w:t>流程实践：</w:t>
-            </w:r>
-            <w:r>
-              <w:rPr>
-                <w:rFonts w:ascii="Arial" w:hAnsi="Arial" w:eastAsia="Alibaba PuHuiTi R" w:cs="Arial"/>
-                <w:b w:val="0"/>
-                <w:i w:val="0"/>
-                <w:color w:val="141414"/>
-                <w:sz w:val="21"/>
-              </w:rPr>
-              <w:t>使用自建自动化脚本完成华泰证券 IP 内容制作，将生成工具、制作流程与人工质量检查结合。</w:t>
-            </w:r>
-          </w:p>
-          <w:p>
-            <w:pPr>
-              <w:keepNext w:val="0"/>
-              <w:keepLines/>
-              <w:spacing w:before="0" w:after="0" w:line="113" w:lineRule="exact"/>
-            </w:pPr>
-          </w:p>
-          <w:p>
-            <w:pPr>
-              <w:keepNext/>
-              <w:keepLines/>
-              <w:spacing w:before="0" w:after="40" w:line="300" w:lineRule="exact"/>
-            </w:pPr>
-            <w:r>
-              <w:rPr>
-                <w:rFonts w:ascii="Arial" w:hAnsi="Arial" w:eastAsia="Alibaba PuHuiTi B" w:cs="Arial"/>
-                <w:b/>
-                <w:i w:val="0"/>
-                <w:color w:val="141414"/>
-                <w:sz w:val="22"/>
-              </w:rPr>
-              <w:t>科莱奥达电子商务 · 设计</w:t>
-            </w:r>
-          </w:p>
-          <w:p>
-            <w:pPr>
-              <w:keepNext/>
-              <w:keepLines/>
-              <w:spacing w:before="0" w:after="80" w:line="240" w:lineRule="exact"/>
-            </w:pPr>
-            <w:r>
-              <w:rPr>
-                <w:rFonts w:ascii="Arial" w:hAnsi="Arial" w:eastAsia="Alibaba PuHuiTi R" w:cs="Arial"/>
-                <w:b w:val="0"/>
-                <w:i w:val="0"/>
-                <w:color w:val="45413D"/>
-                <w:sz w:val="19"/>
-              </w:rPr>
-              <w:t>2023.04 - 2023.10</w:t>
-            </w:r>
-          </w:p>
-          <w:p>
-            <w:pPr>
-              <w:keepNext w:val="0"/>
-              <w:keepLines/>
-              <w:spacing w:before="0" w:after="40" w:line="270" w:lineRule="exact"/>
-              <w:ind w:left="170" w:hanging="170"/>
-            </w:pPr>
-            <w:r>
-              <w:rPr>
-                <w:rFonts w:ascii="Arial" w:hAnsi="Arial" w:eastAsia="Alibaba PuHuiTi R" w:cs="Arial"/>
-                <w:b w:val="0"/>
-                <w:i w:val="0"/>
-                <w:color w:val="141414"/>
-                <w:sz w:val="21"/>
-              </w:rPr>
-              <w:t xml:space="preserve">•  </w:t>
-            </w:r>
-            <w:r>
-              <w:rPr>
-                <w:rFonts w:ascii="Arial" w:hAnsi="Arial" w:eastAsia="Alibaba PuHuiTi B" w:cs="Arial"/>
-                <w:b/>
-                <w:i w:val="0"/>
-                <w:color w:val="141414"/>
-                <w:sz w:val="21"/>
-              </w:rPr>
-              <w:t>电商场景：</w:t>
-            </w:r>
-            <w:r>
-              <w:rPr>
-                <w:rFonts w:ascii="Arial" w:hAnsi="Arial" w:eastAsia="Alibaba PuHuiTi R" w:cs="Arial"/>
-                <w:b w:val="0"/>
-                <w:i w:val="0"/>
-                <w:color w:val="141414"/>
-                <w:sz w:val="21"/>
-              </w:rPr>
-              <w:t>负责地毯主图、详情页、3D 渲染与图像处理，围绕商品特征、应用场景及家居搭配制作展示素材。</w:t>
-            </w:r>
-          </w:p>
-          <w:p>
-            <w:pPr>
-              <w:keepNext w:val="0"/>
-              <w:keepLines/>
-              <w:spacing w:before="0" w:after="40" w:line="270" w:lineRule="exact"/>
-              <w:ind w:left="170" w:hanging="170"/>
-            </w:pPr>
-            <w:r>
-              <w:rPr>
-                <w:rFonts w:ascii="Arial" w:hAnsi="Arial" w:eastAsia="Alibaba PuHuiTi R" w:cs="Arial"/>
-                <w:b w:val="0"/>
-                <w:i w:val="0"/>
-                <w:color w:val="141414"/>
-                <w:sz w:val="21"/>
-              </w:rPr>
-              <w:t xml:space="preserve">•  </w:t>
-            </w:r>
-            <w:r>
-              <w:rPr>
-                <w:rFonts w:ascii="Arial" w:hAnsi="Arial" w:eastAsia="Alibaba PuHuiTi B" w:cs="Arial"/>
-                <w:b/>
-                <w:i w:val="0"/>
-                <w:color w:val="141414"/>
-                <w:sz w:val="21"/>
-              </w:rPr>
-              <w:t>流程标准：</w:t>
-            </w:r>
-            <w:r>
-              <w:rPr>
-                <w:rFonts w:ascii="Arial" w:hAnsi="Arial" w:eastAsia="Alibaba PuHuiTi R" w:cs="Arial"/>
-                <w:b w:val="0"/>
-                <w:i w:val="0"/>
-                <w:color w:val="141414"/>
-                <w:sz w:val="21"/>
-              </w:rPr>
-              <w:t>梳理渲染制作流程与图片质量标准，形成天津武清地毯行业的图像生产方法，相关方法仍被原团队沿用。</w:t>
-            </w:r>
-          </w:p>
-          <w:p>
-            <w:pPr>
-              <w:keepNext w:val="0"/>
-              <w:keepLines/>
-              <w:spacing w:before="0" w:after="0" w:line="170" w:lineRule="exact"/>
-            </w:pPr>
-          </w:p>
-          <w:p>
-            <w:pPr>
-              <w:keepNext/>
-              <w:keepLines/>
-              <w:spacing w:before="0" w:after="80" w:line="340" w:lineRule="exact"/>
-            </w:pPr>
-            <w:r>
-              <w:rPr>
-                <w:rFonts w:ascii="Arial Black" w:hAnsi="Arial Black" w:eastAsia="Alibaba PuHuiTi B" w:cs="Arial Black"/>
-                <w:b/>
-                <w:i w:val="0"/>
-                <w:color w:val="000000"/>
-                <w:sz w:val="23"/>
-              </w:rPr>
               <w:t>PRODUCT / 01</w:t>
             </w:r>
             <w:r>
@@ -1152,6 +833,284 @@
                 <w:sz w:val="21"/>
               </w:rPr>
               <w:t>通过 Codex、Superpowers 辅助完成前后端开发，使用 React / TypeScript、Node.js / Fastify 与 Supabase，实现素材输入、任务状态、接口适配及结果保存。</w:t>
+            </w:r>
+          </w:p>
+          <w:p>
+            <w:pPr>
+              <w:keepNext w:val="0"/>
+              <w:keepLines/>
+              <w:spacing w:before="0" w:after="0" w:line="283" w:lineRule="exact"/>
+            </w:pPr>
+          </w:p>
+          <w:p>
+            <w:pPr>
+              <w:keepNext/>
+              <w:keepLines/>
+              <w:spacing w:before="0" w:after="80" w:line="340" w:lineRule="exact"/>
+            </w:pPr>
+            <w:r>
+              <w:rPr>
+                <w:rFonts w:ascii="Arial Black" w:hAnsi="Arial Black" w:eastAsia="Alibaba PuHuiTi B" w:cs="Arial Black"/>
+                <w:b/>
+                <w:i w:val="0"/>
+                <w:color w:val="000000"/>
+                <w:sz w:val="23"/>
+              </w:rPr>
+              <w:t>PRODUCT / 02</w:t>
+            </w:r>
+            <w:r>
+              <w:rPr>
+                <w:rFonts w:ascii="Arial" w:hAnsi="Arial" w:eastAsia="Alibaba PuHuiTi B" w:cs="Arial"/>
+                <w:b/>
+                <w:i w:val="0"/>
+                <w:color w:val="000000"/>
+                <w:sz w:val="21"/>
+              </w:rPr>
+              <w:t xml:space="preserve">  /  阶段式 Agent 工作台</w:t>
+            </w:r>
+          </w:p>
+          <w:p>
+            <w:pPr>
+              <w:keepNext/>
+              <w:keepLines/>
+              <w:spacing w:before="0" w:after="40" w:line="320" w:lineRule="exact"/>
+            </w:pPr>
+            <w:hyperlink r:id="rId15">
+              <w:r>
+                <w:rPr>
+                  <w:rFonts w:ascii="Arial" w:hAnsi="Arial" w:eastAsia="Alibaba PuHuiTi B"/>
+                  <w:sz w:val="24"/>
+                  <w:color w:val="000000"/>
+                  <w:b/>
+                </w:rPr>
+                <w:t>PM OS AI 产品工作台</w:t>
+              </w:r>
+            </w:hyperlink>
+          </w:p>
+          <w:p>
+            <w:pPr>
+              <w:keepNext/>
+              <w:keepLines/>
+              <w:spacing w:before="0" w:after="40" w:line="240" w:lineRule="exact"/>
+            </w:pPr>
+            <w:r>
+              <w:rPr>
+                <w:rFonts w:ascii="Arial" w:hAnsi="Arial" w:eastAsia="Alibaba PuHuiTi R" w:cs="Arial"/>
+                <w:b w:val="0"/>
+                <w:i w:val="0"/>
+                <w:color w:val="45413D"/>
+                <w:sz w:val="19"/>
+              </w:rPr>
+              <w:t>产品方法、工作流设计与独立实现</w:t>
+            </w:r>
+          </w:p>
+          <w:p>
+            <w:pPr>
+              <w:keepNext/>
+              <w:keepLines/>
+              <w:spacing w:before="0" w:after="80" w:line="240" w:lineRule="exact"/>
+            </w:pPr>
+            <w:r>
+              <w:rPr>
+                <w:rFonts w:ascii="Arial" w:hAnsi="Arial" w:eastAsia="Alibaba PuHuiTi R" w:cs="Arial"/>
+                <w:b w:val="0"/>
+                <w:i w:val="0"/>
+                <w:color w:val="45413D"/>
+                <w:sz w:val="19"/>
+              </w:rPr>
+              <w:t>个人产品项目 · 已验证部分执行与交接机制 · 持续开发</w:t>
+            </w:r>
+          </w:p>
+          <w:p>
+            <w:pPr>
+              <w:keepNext w:val="0"/>
+              <w:keepLines/>
+              <w:spacing w:before="0" w:after="40" w:line="280" w:lineRule="exact"/>
+              <w:ind w:left="170" w:hanging="170"/>
+            </w:pPr>
+            <w:r>
+              <w:rPr>
+                <w:rFonts w:ascii="Arial" w:hAnsi="Arial" w:eastAsia="Alibaba PuHuiTi R" w:cs="Arial"/>
+                <w:b w:val="0"/>
+                <w:i w:val="0"/>
+                <w:color w:val="141414"/>
+                <w:sz w:val="21"/>
+              </w:rPr>
+              <w:t xml:space="preserve">•  </w:t>
+            </w:r>
+            <w:r>
+              <w:rPr>
+                <w:rFonts w:ascii="Arial" w:hAnsi="Arial" w:eastAsia="Alibaba PuHuiTi B" w:cs="Arial"/>
+                <w:b/>
+                <w:i w:val="0"/>
+                <w:color w:val="141414"/>
+                <w:sz w:val="21"/>
+              </w:rPr>
+              <w:t>流程定义：</w:t>
+            </w:r>
+            <w:r>
+              <w:rPr>
+                <w:rFonts w:ascii="Arial" w:hAnsi="Arial" w:eastAsia="Alibaba PuHuiTi R" w:cs="Arial"/>
+                <w:b w:val="0"/>
+                <w:i w:val="0"/>
+                <w:color w:val="141414"/>
+                <w:sz w:val="21"/>
+              </w:rPr>
+              <w:t xml:space="preserve">设计从问题发现到交付复盘的 </w:t>
+            </w:r>
+            <w:r>
+              <w:rPr>
+                <w:rFonts w:ascii="Arial" w:hAnsi="Arial" w:eastAsia="Alibaba PuHuiTi B" w:cs="Arial"/>
+                <w:b/>
+                <w:i w:val="0"/>
+                <w:color w:val="141414"/>
+                <w:sz w:val="21"/>
+              </w:rPr>
+              <w:t>8 阶段</w:t>
+            </w:r>
+            <w:r>
+              <w:rPr>
+                <w:rFonts w:ascii="Arial" w:hAnsi="Arial" w:eastAsia="Alibaba PuHuiTi R" w:cs="Arial"/>
+                <w:b w:val="0"/>
+                <w:i w:val="0"/>
+                <w:color w:val="141414"/>
+                <w:sz w:val="21"/>
+              </w:rPr>
+              <w:t>工作台，明确各阶段输入、产出与人工确认条件，将产品方法组织为可执行流程。</w:t>
+            </w:r>
+          </w:p>
+          <w:p>
+            <w:pPr>
+              <w:keepNext w:val="0"/>
+              <w:keepLines/>
+              <w:spacing w:before="0" w:after="40" w:line="280" w:lineRule="exact"/>
+              <w:ind w:left="170" w:hanging="170"/>
+            </w:pPr>
+            <w:r>
+              <w:rPr>
+                <w:rFonts w:ascii="Arial" w:hAnsi="Arial" w:eastAsia="Alibaba PuHuiTi R" w:cs="Arial"/>
+                <w:b w:val="0"/>
+                <w:i w:val="0"/>
+                <w:color w:val="141414"/>
+                <w:sz w:val="21"/>
+              </w:rPr>
+              <w:t xml:space="preserve">•  </w:t>
+            </w:r>
+            <w:r>
+              <w:rPr>
+                <w:rFonts w:ascii="Arial" w:hAnsi="Arial" w:eastAsia="Alibaba PuHuiTi B" w:cs="Arial"/>
+                <w:b/>
+                <w:i w:val="0"/>
+                <w:color w:val="141414"/>
+                <w:sz w:val="21"/>
+              </w:rPr>
+              <w:t>Agent 实现：</w:t>
+            </w:r>
+            <w:r>
+              <w:rPr>
+                <w:rFonts w:ascii="Arial" w:hAnsi="Arial" w:eastAsia="Alibaba PuHuiTi R" w:cs="Arial"/>
+                <w:b w:val="0"/>
+                <w:i w:val="0"/>
+                <w:color w:val="141414"/>
+                <w:sz w:val="21"/>
+              </w:rPr>
+              <w:t>使用 Agno 组织阶段执行，通过 AI 辅助开发资料版本、原文引用、报告确认、运行输入快照及相邻阶段交接，保留执行依据。</w:t>
+            </w:r>
+          </w:p>
+          <w:p>
+            <w:pPr>
+              <w:keepNext w:val="0"/>
+              <w:keepLines/>
+              <w:spacing w:before="0" w:after="40" w:line="280" w:lineRule="exact"/>
+              <w:ind w:left="170" w:hanging="170"/>
+            </w:pPr>
+            <w:r>
+              <w:rPr>
+                <w:rFonts w:ascii="Arial" w:hAnsi="Arial" w:eastAsia="Alibaba PuHuiTi R" w:cs="Arial"/>
+                <w:b w:val="0"/>
+                <w:i w:val="0"/>
+                <w:color w:val="141414"/>
+                <w:sz w:val="21"/>
+              </w:rPr>
+              <w:t xml:space="preserve">•  </w:t>
+            </w:r>
+            <w:r>
+              <w:rPr>
+                <w:rFonts w:ascii="Arial" w:hAnsi="Arial" w:eastAsia="Alibaba PuHuiTi B" w:cs="Arial"/>
+                <w:b/>
+                <w:i w:val="0"/>
+                <w:color w:val="141414"/>
+                <w:sz w:val="21"/>
+              </w:rPr>
+              <w:t>异常验证：</w:t>
+            </w:r>
+            <w:r>
+              <w:rPr>
+                <w:rFonts w:ascii="Arial" w:hAnsi="Arial" w:eastAsia="Alibaba PuHuiTi R" w:cs="Arial"/>
+                <w:b w:val="0"/>
+                <w:i w:val="0"/>
+                <w:color w:val="141414"/>
+                <w:sz w:val="21"/>
+              </w:rPr>
+              <w:t>在模拟业务材料的真实模型测试中，识别模型把报告／交接 ID 误当成来源 ID 的问题；通过引用类型校验拦截，追问修正后采用并保存。</w:t>
+            </w:r>
+          </w:p>
+          <w:p>
+            <w:pPr>
+              <w:keepNext w:val="0"/>
+              <w:keepLines/>
+              <w:spacing w:before="0" w:after="40" w:line="280" w:lineRule="exact"/>
+              <w:ind w:left="170" w:hanging="170"/>
+            </w:pPr>
+            <w:r>
+              <w:rPr>
+                <w:rFonts w:ascii="Arial" w:hAnsi="Arial" w:eastAsia="Alibaba PuHuiTi R" w:cs="Arial"/>
+                <w:b w:val="0"/>
+                <w:i w:val="0"/>
+                <w:color w:val="141414"/>
+                <w:sz w:val="21"/>
+              </w:rPr>
+              <w:t xml:space="preserve">•  </w:t>
+            </w:r>
+            <w:r>
+              <w:rPr>
+                <w:rFonts w:ascii="Arial" w:hAnsi="Arial" w:eastAsia="Alibaba PuHuiTi B" w:cs="Arial"/>
+                <w:b/>
+                <w:i w:val="0"/>
+                <w:color w:val="141414"/>
+                <w:sz w:val="21"/>
+              </w:rPr>
+              <w:t>质量控制：</w:t>
+            </w:r>
+            <w:r>
+              <w:rPr>
+                <w:rFonts w:ascii="Arial" w:hAnsi="Arial" w:eastAsia="Alibaba PuHuiTi R" w:cs="Arial"/>
+                <w:b w:val="0"/>
+                <w:i w:val="0"/>
+                <w:color w:val="141414"/>
+                <w:sz w:val="21"/>
+              </w:rPr>
+              <w:t xml:space="preserve">区分模型生成、人工采用与阶段验收；上游变更后复核下游，保留草稿、确认版与历史输入。完整 </w:t>
+            </w:r>
+            <w:r>
+              <w:rPr>
+                <w:rFonts w:ascii="Arial" w:hAnsi="Arial" w:eastAsia="Alibaba PuHuiTi B" w:cs="Arial"/>
+                <w:b/>
+                <w:i w:val="0"/>
+                <w:color w:val="141414"/>
+                <w:sz w:val="21"/>
+              </w:rPr>
+              <w:t>8 阶段</w:t>
+            </w:r>
+            <w:r>
+              <w:rPr>
+                <w:rFonts w:ascii="Arial" w:hAnsi="Arial" w:eastAsia="Alibaba PuHuiTi R" w:cs="Arial"/>
+                <w:b w:val="0"/>
+                <w:i w:val="0"/>
+                <w:color w:val="141414"/>
+                <w:sz w:val="21"/>
+              </w:rPr>
+              <w:t>业务验收仍在推进。</w:t>
             </w:r>
           </w:p>
         </w:tc>
@@ -1635,9 +1594,9 @@
                 <w:b/>
                 <w:i w:val="0"/>
                 <w:color w:val="141414"/>
-                <w:sz w:val="48"/>
+                <w:sz w:val="40"/>
               </w:rPr>
-              <w:t>PRODUCT PRACTICE</w:t>
+              <w:t>PROJECTS &amp; EXPERIENCE</w:t>
             </w:r>
           </w:p>
           <w:p>
@@ -1654,7 +1613,7 @@
                 <w:color w:val="141414"/>
                 <w:sz w:val="26"/>
               </w:rPr>
-              <w:t>产品项目与实践</w:t>
+              <w:t>产品实践与工作经历</w:t>
             </w:r>
           </w:p>
         </w:tc>
@@ -1732,7 +1691,7 @@
               <w:keepLines/>
               <w:spacing w:before="0" w:after="0" w:line="240" w:lineRule="exact"/>
             </w:pPr>
-            <w:hyperlink r:id="rId15">
+            <w:hyperlink r:id="rId16">
               <w:r>
                 <w:rPr>
                   <w:rFonts w:ascii="Arial" w:hAnsi="Arial" w:eastAsia="Alibaba PuHuiTi R"/>
@@ -1798,284 +1757,6 @@
                 <w:sz w:val="2"/>
               </w:rPr>
             </w:r>
-          </w:p>
-          <w:p>
-            <w:pPr>
-              <w:keepNext/>
-              <w:keepLines/>
-              <w:spacing w:before="0" w:after="80" w:line="340" w:lineRule="exact"/>
-            </w:pPr>
-            <w:r>
-              <w:rPr>
-                <w:rFonts w:ascii="Arial Black" w:hAnsi="Arial Black" w:eastAsia="Alibaba PuHuiTi B" w:cs="Arial Black"/>
-                <w:b/>
-                <w:i w:val="0"/>
-                <w:color w:val="000000"/>
-                <w:sz w:val="23"/>
-              </w:rPr>
-              <w:t>PRODUCT / 02</w:t>
-            </w:r>
-            <w:r>
-              <w:rPr>
-                <w:rFonts w:ascii="Arial" w:hAnsi="Arial" w:eastAsia="Alibaba PuHuiTi B" w:cs="Arial"/>
-                <w:b/>
-                <w:i w:val="0"/>
-                <w:color w:val="000000"/>
-                <w:sz w:val="21"/>
-              </w:rPr>
-              <w:t xml:space="preserve">  /  阶段式 Agent 工作台</w:t>
-            </w:r>
-          </w:p>
-          <w:p>
-            <w:pPr>
-              <w:keepNext/>
-              <w:keepLines/>
-              <w:spacing w:before="0" w:after="40" w:line="320" w:lineRule="exact"/>
-            </w:pPr>
-            <w:hyperlink r:id="rId16">
-              <w:r>
-                <w:rPr>
-                  <w:rFonts w:ascii="Arial" w:hAnsi="Arial" w:eastAsia="Alibaba PuHuiTi B"/>
-                  <w:sz w:val="24"/>
-                  <w:color w:val="000000"/>
-                  <w:b/>
-                </w:rPr>
-                <w:t>PM OS AI 产品工作台</w:t>
-              </w:r>
-            </w:hyperlink>
-          </w:p>
-          <w:p>
-            <w:pPr>
-              <w:keepNext/>
-              <w:keepLines/>
-              <w:spacing w:before="0" w:after="40" w:line="240" w:lineRule="exact"/>
-            </w:pPr>
-            <w:r>
-              <w:rPr>
-                <w:rFonts w:ascii="Arial" w:hAnsi="Arial" w:eastAsia="Alibaba PuHuiTi R" w:cs="Arial"/>
-                <w:b w:val="0"/>
-                <w:i w:val="0"/>
-                <w:color w:val="45413D"/>
-                <w:sz w:val="19"/>
-              </w:rPr>
-              <w:t>产品方法、工作流设计与独立实现</w:t>
-            </w:r>
-          </w:p>
-          <w:p>
-            <w:pPr>
-              <w:keepNext/>
-              <w:keepLines/>
-              <w:spacing w:before="0" w:after="80" w:line="240" w:lineRule="exact"/>
-            </w:pPr>
-            <w:r>
-              <w:rPr>
-                <w:rFonts w:ascii="Arial" w:hAnsi="Arial" w:eastAsia="Alibaba PuHuiTi R" w:cs="Arial"/>
-                <w:b w:val="0"/>
-                <w:i w:val="0"/>
-                <w:color w:val="45413D"/>
-                <w:sz w:val="19"/>
-              </w:rPr>
-              <w:t>个人产品项目 · 已验证部分执行与交接机制 · 持续开发</w:t>
-            </w:r>
-          </w:p>
-          <w:p>
-            <w:pPr>
-              <w:keepNext w:val="0"/>
-              <w:keepLines/>
-              <w:spacing w:before="0" w:after="40" w:line="280" w:lineRule="exact"/>
-              <w:ind w:left="170" w:hanging="170"/>
-            </w:pPr>
-            <w:r>
-              <w:rPr>
-                <w:rFonts w:ascii="Arial" w:hAnsi="Arial" w:eastAsia="Alibaba PuHuiTi R" w:cs="Arial"/>
-                <w:b w:val="0"/>
-                <w:i w:val="0"/>
-                <w:color w:val="141414"/>
-                <w:sz w:val="21"/>
-              </w:rPr>
-              <w:t xml:space="preserve">•  </w:t>
-            </w:r>
-            <w:r>
-              <w:rPr>
-                <w:rFonts w:ascii="Arial" w:hAnsi="Arial" w:eastAsia="Alibaba PuHuiTi B" w:cs="Arial"/>
-                <w:b/>
-                <w:i w:val="0"/>
-                <w:color w:val="141414"/>
-                <w:sz w:val="21"/>
-              </w:rPr>
-              <w:t>流程定义：</w:t>
-            </w:r>
-            <w:r>
-              <w:rPr>
-                <w:rFonts w:ascii="Arial" w:hAnsi="Arial" w:eastAsia="Alibaba PuHuiTi R" w:cs="Arial"/>
-                <w:b w:val="0"/>
-                <w:i w:val="0"/>
-                <w:color w:val="141414"/>
-                <w:sz w:val="21"/>
-              </w:rPr>
-              <w:t xml:space="preserve">设计从问题发现到交付复盘的 </w:t>
-            </w:r>
-            <w:r>
-              <w:rPr>
-                <w:rFonts w:ascii="Arial" w:hAnsi="Arial" w:eastAsia="Alibaba PuHuiTi B" w:cs="Arial"/>
-                <w:b/>
-                <w:i w:val="0"/>
-                <w:color w:val="141414"/>
-                <w:sz w:val="21"/>
-              </w:rPr>
-              <w:t>8 阶段</w:t>
-            </w:r>
-            <w:r>
-              <w:rPr>
-                <w:rFonts w:ascii="Arial" w:hAnsi="Arial" w:eastAsia="Alibaba PuHuiTi R" w:cs="Arial"/>
-                <w:b w:val="0"/>
-                <w:i w:val="0"/>
-                <w:color w:val="141414"/>
-                <w:sz w:val="21"/>
-              </w:rPr>
-              <w:t>工作台，明确各阶段输入、产出与人工确认条件，将产品方法组织为可执行流程。</w:t>
-            </w:r>
-          </w:p>
-          <w:p>
-            <w:pPr>
-              <w:keepNext w:val="0"/>
-              <w:keepLines/>
-              <w:spacing w:before="0" w:after="40" w:line="280" w:lineRule="exact"/>
-              <w:ind w:left="170" w:hanging="170"/>
-            </w:pPr>
-            <w:r>
-              <w:rPr>
-                <w:rFonts w:ascii="Arial" w:hAnsi="Arial" w:eastAsia="Alibaba PuHuiTi R" w:cs="Arial"/>
-                <w:b w:val="0"/>
-                <w:i w:val="0"/>
-                <w:color w:val="141414"/>
-                <w:sz w:val="21"/>
-              </w:rPr>
-              <w:t xml:space="preserve">•  </w:t>
-            </w:r>
-            <w:r>
-              <w:rPr>
-                <w:rFonts w:ascii="Arial" w:hAnsi="Arial" w:eastAsia="Alibaba PuHuiTi B" w:cs="Arial"/>
-                <w:b/>
-                <w:i w:val="0"/>
-                <w:color w:val="141414"/>
-                <w:sz w:val="21"/>
-              </w:rPr>
-              <w:t>Agent 实现：</w:t>
-            </w:r>
-            <w:r>
-              <w:rPr>
-                <w:rFonts w:ascii="Arial" w:hAnsi="Arial" w:eastAsia="Alibaba PuHuiTi R" w:cs="Arial"/>
-                <w:b w:val="0"/>
-                <w:i w:val="0"/>
-                <w:color w:val="141414"/>
-                <w:sz w:val="21"/>
-              </w:rPr>
-              <w:t>使用 Agno 组织阶段执行，通过 AI 辅助开发资料版本、原文引用、报告确认、运行输入快照及相邻阶段交接，保留执行依据。</w:t>
-            </w:r>
-          </w:p>
-          <w:p>
-            <w:pPr>
-              <w:keepNext w:val="0"/>
-              <w:keepLines/>
-              <w:spacing w:before="0" w:after="40" w:line="280" w:lineRule="exact"/>
-              <w:ind w:left="170" w:hanging="170"/>
-            </w:pPr>
-            <w:r>
-              <w:rPr>
-                <w:rFonts w:ascii="Arial" w:hAnsi="Arial" w:eastAsia="Alibaba PuHuiTi R" w:cs="Arial"/>
-                <w:b w:val="0"/>
-                <w:i w:val="0"/>
-                <w:color w:val="141414"/>
-                <w:sz w:val="21"/>
-              </w:rPr>
-              <w:t xml:space="preserve">•  </w:t>
-            </w:r>
-            <w:r>
-              <w:rPr>
-                <w:rFonts w:ascii="Arial" w:hAnsi="Arial" w:eastAsia="Alibaba PuHuiTi B" w:cs="Arial"/>
-                <w:b/>
-                <w:i w:val="0"/>
-                <w:color w:val="141414"/>
-                <w:sz w:val="21"/>
-              </w:rPr>
-              <w:t>异常验证：</w:t>
-            </w:r>
-            <w:r>
-              <w:rPr>
-                <w:rFonts w:ascii="Arial" w:hAnsi="Arial" w:eastAsia="Alibaba PuHuiTi R" w:cs="Arial"/>
-                <w:b w:val="0"/>
-                <w:i w:val="0"/>
-                <w:color w:val="141414"/>
-                <w:sz w:val="21"/>
-              </w:rPr>
-              <w:t>在模拟业务材料的真实模型测试中，识别模型把报告／交接 ID 误当成来源 ID 的问题；通过引用类型校验拦截，追问修正后采用并保存。</w:t>
-            </w:r>
-          </w:p>
-          <w:p>
-            <w:pPr>
-              <w:keepNext w:val="0"/>
-              <w:keepLines/>
-              <w:spacing w:before="0" w:after="40" w:line="280" w:lineRule="exact"/>
-              <w:ind w:left="170" w:hanging="170"/>
-            </w:pPr>
-            <w:r>
-              <w:rPr>
-                <w:rFonts w:ascii="Arial" w:hAnsi="Arial" w:eastAsia="Alibaba PuHuiTi R" w:cs="Arial"/>
-                <w:b w:val="0"/>
-                <w:i w:val="0"/>
-                <w:color w:val="141414"/>
-                <w:sz w:val="21"/>
-              </w:rPr>
-              <w:t xml:space="preserve">•  </w:t>
-            </w:r>
-            <w:r>
-              <w:rPr>
-                <w:rFonts w:ascii="Arial" w:hAnsi="Arial" w:eastAsia="Alibaba PuHuiTi B" w:cs="Arial"/>
-                <w:b/>
-                <w:i w:val="0"/>
-                <w:color w:val="141414"/>
-                <w:sz w:val="21"/>
-              </w:rPr>
-              <w:t>质量控制：</w:t>
-            </w:r>
-            <w:r>
-              <w:rPr>
-                <w:rFonts w:ascii="Arial" w:hAnsi="Arial" w:eastAsia="Alibaba PuHuiTi R" w:cs="Arial"/>
-                <w:b w:val="0"/>
-                <w:i w:val="0"/>
-                <w:color w:val="141414"/>
-                <w:sz w:val="21"/>
-              </w:rPr>
-              <w:t xml:space="preserve">区分模型生成、人工采用与阶段验收；上游变更后复核下游，保留草稿、确认版与历史输入。完整 </w:t>
-            </w:r>
-            <w:r>
-              <w:rPr>
-                <w:rFonts w:ascii="Arial" w:hAnsi="Arial" w:eastAsia="Alibaba PuHuiTi B" w:cs="Arial"/>
-                <w:b/>
-                <w:i w:val="0"/>
-                <w:color w:val="141414"/>
-                <w:sz w:val="21"/>
-              </w:rPr>
-              <w:t>8 阶段</w:t>
-            </w:r>
-            <w:r>
-              <w:rPr>
-                <w:rFonts w:ascii="Arial" w:hAnsi="Arial" w:eastAsia="Alibaba PuHuiTi R" w:cs="Arial"/>
-                <w:b w:val="0"/>
-                <w:i w:val="0"/>
-                <w:color w:val="141414"/>
-                <w:sz w:val="21"/>
-              </w:rPr>
-              <w:t>业务验收仍在推进。</w:t>
-            </w:r>
-          </w:p>
-          <w:p>
-            <w:pPr>
-              <w:keepNext w:val="0"/>
-              <w:keepLines/>
-              <w:spacing w:before="0" w:after="0" w:line="283" w:lineRule="exact"/>
-            </w:pPr>
           </w:p>
           <w:p>
             <w:pPr>
@@ -2437,6 +2118,325 @@
                 <w:sz w:val="21"/>
               </w:rPr>
               <w:t>北京商家并进行线下需求接触，整理经营看板、营销准备与回访流程，交付方案和交互原型。</w:t>
+            </w:r>
+          </w:p>
+          <w:p>
+            <w:pPr>
+              <w:keepNext w:val="0"/>
+              <w:keepLines/>
+              <w:spacing w:before="0" w:after="0" w:line="283" w:lineRule="exact"/>
+            </w:pPr>
+          </w:p>
+          <w:p>
+            <w:pPr>
+              <w:keepNext/>
+              <w:keepLines/>
+              <w:spacing w:before="0" w:after="80" w:line="340" w:lineRule="exact"/>
+            </w:pPr>
+            <w:r>
+              <w:rPr>
+                <w:rFonts w:ascii="Arial Black" w:hAnsi="Arial Black" w:eastAsia="Alibaba PuHuiTi B" w:cs="Arial Black"/>
+                <w:b/>
+                <w:i w:val="0"/>
+                <w:color w:val="000000"/>
+                <w:sz w:val="23"/>
+              </w:rPr>
+              <w:t>EXPERIENCE</w:t>
+            </w:r>
+            <w:r>
+              <w:rPr>
+                <w:rFonts w:ascii="Arial" w:hAnsi="Arial" w:eastAsia="Alibaba PuHuiTi B" w:cs="Arial"/>
+                <w:b/>
+                <w:i w:val="0"/>
+                <w:color w:val="000000"/>
+                <w:sz w:val="21"/>
+              </w:rPr>
+              <w:t xml:space="preserve">  /  工作经历</w:t>
+            </w:r>
+          </w:p>
+          <w:p>
+            <w:pPr>
+              <w:keepNext/>
+              <w:keepLines/>
+              <w:spacing w:before="0" w:after="40" w:line="300" w:lineRule="exact"/>
+            </w:pPr>
+            <w:r>
+              <w:rPr>
+                <w:rFonts w:ascii="Arial" w:hAnsi="Arial" w:eastAsia="Alibaba PuHuiTi B" w:cs="Arial"/>
+                <w:b/>
+                <w:i w:val="0"/>
+                <w:color w:val="141414"/>
+                <w:sz w:val="22"/>
+              </w:rPr>
+              <w:t>中科趋势 · AIGC 设计师</w:t>
+            </w:r>
+          </w:p>
+          <w:p>
+            <w:pPr>
+              <w:keepNext/>
+              <w:keepLines/>
+              <w:spacing w:before="0" w:after="80" w:line="240" w:lineRule="exact"/>
+            </w:pPr>
+            <w:r>
+              <w:rPr>
+                <w:rFonts w:ascii="Arial" w:hAnsi="Arial" w:eastAsia="Alibaba PuHuiTi R" w:cs="Arial"/>
+                <w:b w:val="0"/>
+                <w:i w:val="0"/>
+                <w:color w:val="45413D"/>
+                <w:sz w:val="19"/>
+              </w:rPr>
+              <w:t>2024.03 - 至今</w:t>
+            </w:r>
+          </w:p>
+          <w:p>
+            <w:pPr>
+              <w:keepNext w:val="0"/>
+              <w:keepLines/>
+              <w:spacing w:before="0" w:after="40" w:line="270" w:lineRule="exact"/>
+              <w:ind w:left="170" w:hanging="170"/>
+            </w:pPr>
+            <w:r>
+              <w:rPr>
+                <w:rFonts w:ascii="Arial" w:hAnsi="Arial" w:eastAsia="Alibaba PuHuiTi R" w:cs="Arial"/>
+                <w:b w:val="0"/>
+                <w:i w:val="0"/>
+                <w:color w:val="141414"/>
+                <w:sz w:val="21"/>
+              </w:rPr>
+              <w:t xml:space="preserve">•  </w:t>
+            </w:r>
+            <w:r>
+              <w:rPr>
+                <w:rFonts w:ascii="Arial" w:hAnsi="Arial" w:eastAsia="Alibaba PuHuiTi B" w:cs="Arial"/>
+                <w:b/>
+                <w:i w:val="0"/>
+                <w:color w:val="141414"/>
+                <w:sz w:val="21"/>
+              </w:rPr>
+              <w:t>需求与交付：</w:t>
+            </w:r>
+            <w:r>
+              <w:rPr>
+                <w:rFonts w:ascii="Arial" w:hAnsi="Arial" w:eastAsia="Alibaba PuHuiTi R" w:cs="Arial"/>
+                <w:b w:val="0"/>
+                <w:i w:val="0"/>
+                <w:color w:val="141414"/>
+                <w:sz w:val="21"/>
+              </w:rPr>
+              <w:t>将客户需求转化为制作方案，推进生成、修改与交付；独立完成中国联通 IP 贺岁视频，负责南方基金项目从需求沟通到成片交付。</w:t>
+            </w:r>
+          </w:p>
+          <w:p>
+            <w:pPr>
+              <w:keepNext w:val="0"/>
+              <w:keepLines/>
+              <w:spacing w:before="0" w:after="40" w:line="270" w:lineRule="exact"/>
+              <w:ind w:left="170" w:hanging="170"/>
+            </w:pPr>
+            <w:r>
+              <w:rPr>
+                <w:rFonts w:ascii="Arial" w:hAnsi="Arial" w:eastAsia="Alibaba PuHuiTi R" w:cs="Arial"/>
+                <w:b w:val="0"/>
+                <w:i w:val="0"/>
+                <w:color w:val="141414"/>
+                <w:sz w:val="21"/>
+              </w:rPr>
+              <w:t xml:space="preserve">•  </w:t>
+            </w:r>
+            <w:r>
+              <w:rPr>
+                <w:rFonts w:ascii="Arial" w:hAnsi="Arial" w:eastAsia="Alibaba PuHuiTi B" w:cs="Arial"/>
+                <w:b/>
+                <w:i w:val="0"/>
+                <w:color w:val="141414"/>
+                <w:sz w:val="21"/>
+              </w:rPr>
+              <w:t>协作推进：</w:t>
+            </w:r>
+            <w:r>
+              <w:rPr>
+                <w:rFonts w:ascii="Arial" w:hAnsi="Arial" w:eastAsia="Alibaba PuHuiTi R" w:cs="Arial"/>
+                <w:b w:val="0"/>
+                <w:i w:val="0"/>
+                <w:color w:val="141414"/>
+                <w:sz w:val="21"/>
+              </w:rPr>
+              <w:t xml:space="preserve">牵头中国日报网《数字丝路》需求对接与制作，协调 1 位同事完成部分镜头；负责央视 AI「两弹一星」相关视频约 </w:t>
+            </w:r>
+            <w:r>
+              <w:rPr>
+                <w:rFonts w:ascii="Arial" w:hAnsi="Arial" w:eastAsia="Alibaba PuHuiTi B" w:cs="Arial"/>
+                <w:b/>
+                <w:i w:val="0"/>
+                <w:color w:val="141414"/>
+                <w:sz w:val="21"/>
+              </w:rPr>
+              <w:t>70%</w:t>
+            </w:r>
+            <w:r>
+              <w:rPr>
+                <w:rFonts w:ascii="Arial" w:hAnsi="Arial" w:eastAsia="Alibaba PuHuiTi R" w:cs="Arial"/>
+                <w:b w:val="0"/>
+                <w:i w:val="0"/>
+                <w:color w:val="141414"/>
+                <w:sz w:val="21"/>
+              </w:rPr>
+              <w:t xml:space="preserve"> 的镜头制作。</w:t>
+            </w:r>
+          </w:p>
+          <w:p>
+            <w:pPr>
+              <w:keepNext w:val="0"/>
+              <w:keepLines/>
+              <w:spacing w:before="0" w:after="40" w:line="270" w:lineRule="exact"/>
+              <w:ind w:left="170" w:hanging="170"/>
+            </w:pPr>
+            <w:r>
+              <w:rPr>
+                <w:rFonts w:ascii="Arial" w:hAnsi="Arial" w:eastAsia="Alibaba PuHuiTi R" w:cs="Arial"/>
+                <w:b w:val="0"/>
+                <w:i w:val="0"/>
+                <w:color w:val="141414"/>
+                <w:sz w:val="21"/>
+              </w:rPr>
+              <w:t xml:space="preserve">•  </w:t>
+            </w:r>
+            <w:r>
+              <w:rPr>
+                <w:rFonts w:ascii="Arial" w:hAnsi="Arial" w:eastAsia="Alibaba PuHuiTi B" w:cs="Arial"/>
+                <w:b/>
+                <w:i w:val="0"/>
+                <w:color w:val="141414"/>
+                <w:sz w:val="21"/>
+              </w:rPr>
+              <w:t>流程实践：</w:t>
+            </w:r>
+            <w:r>
+              <w:rPr>
+                <w:rFonts w:ascii="Arial" w:hAnsi="Arial" w:eastAsia="Alibaba PuHuiTi R" w:cs="Arial"/>
+                <w:b w:val="0"/>
+                <w:i w:val="0"/>
+                <w:color w:val="141414"/>
+                <w:sz w:val="21"/>
+              </w:rPr>
+              <w:t>使用自建自动化脚本完成华泰证券 IP 内容制作，将生成工具、制作流程与人工质量检查结合。</w:t>
+            </w:r>
+          </w:p>
+          <w:p>
+            <w:pPr>
+              <w:keepNext w:val="0"/>
+              <w:keepLines/>
+              <w:spacing w:before="0" w:after="0" w:line="113" w:lineRule="exact"/>
+            </w:pPr>
+          </w:p>
+          <w:p>
+            <w:pPr>
+              <w:keepNext/>
+              <w:keepLines/>
+              <w:spacing w:before="0" w:after="40" w:line="300" w:lineRule="exact"/>
+            </w:pPr>
+            <w:r>
+              <w:rPr>
+                <w:rFonts w:ascii="Arial" w:hAnsi="Arial" w:eastAsia="Alibaba PuHuiTi B" w:cs="Arial"/>
+                <w:b/>
+                <w:i w:val="0"/>
+                <w:color w:val="141414"/>
+                <w:sz w:val="22"/>
+              </w:rPr>
+              <w:t>科莱奥达电子商务 · 设计</w:t>
+            </w:r>
+          </w:p>
+          <w:p>
+            <w:pPr>
+              <w:keepNext/>
+              <w:keepLines/>
+              <w:spacing w:before="0" w:after="80" w:line="240" w:lineRule="exact"/>
+            </w:pPr>
+            <w:r>
+              <w:rPr>
+                <w:rFonts w:ascii="Arial" w:hAnsi="Arial" w:eastAsia="Alibaba PuHuiTi R" w:cs="Arial"/>
+                <w:b w:val="0"/>
+                <w:i w:val="0"/>
+                <w:color w:val="45413D"/>
+                <w:sz w:val="19"/>
+              </w:rPr>
+              <w:t>2023.04 - 2023.10</w:t>
+            </w:r>
+          </w:p>
+          <w:p>
+            <w:pPr>
+              <w:keepNext w:val="0"/>
+              <w:keepLines/>
+              <w:spacing w:before="0" w:after="40" w:line="270" w:lineRule="exact"/>
+              <w:ind w:left="170" w:hanging="170"/>
+            </w:pPr>
+            <w:r>
+              <w:rPr>
+                <w:rFonts w:ascii="Arial" w:hAnsi="Arial" w:eastAsia="Alibaba PuHuiTi R" w:cs="Arial"/>
+                <w:b w:val="0"/>
+                <w:i w:val="0"/>
+                <w:color w:val="141414"/>
+                <w:sz w:val="21"/>
+              </w:rPr>
+              <w:t xml:space="preserve">•  </w:t>
+            </w:r>
+            <w:r>
+              <w:rPr>
+                <w:rFonts w:ascii="Arial" w:hAnsi="Arial" w:eastAsia="Alibaba PuHuiTi B" w:cs="Arial"/>
+                <w:b/>
+                <w:i w:val="0"/>
+                <w:color w:val="141414"/>
+                <w:sz w:val="21"/>
+              </w:rPr>
+              <w:t>电商场景：</w:t>
+            </w:r>
+            <w:r>
+              <w:rPr>
+                <w:rFonts w:ascii="Arial" w:hAnsi="Arial" w:eastAsia="Alibaba PuHuiTi R" w:cs="Arial"/>
+                <w:b w:val="0"/>
+                <w:i w:val="0"/>
+                <w:color w:val="141414"/>
+                <w:sz w:val="21"/>
+              </w:rPr>
+              <w:t>负责地毯主图、详情页、3D 渲染与图像处理，围绕商品特征、应用场景及家居搭配制作展示素材。</w:t>
+            </w:r>
+          </w:p>
+          <w:p>
+            <w:pPr>
+              <w:keepNext w:val="0"/>
+              <w:keepLines/>
+              <w:spacing w:before="0" w:after="40" w:line="270" w:lineRule="exact"/>
+              <w:ind w:left="170" w:hanging="170"/>
+            </w:pPr>
+            <w:r>
+              <w:rPr>
+                <w:rFonts w:ascii="Arial" w:hAnsi="Arial" w:eastAsia="Alibaba PuHuiTi R" w:cs="Arial"/>
+                <w:b w:val="0"/>
+                <w:i w:val="0"/>
+                <w:color w:val="141414"/>
+                <w:sz w:val="21"/>
+              </w:rPr>
+              <w:t xml:space="preserve">•  </w:t>
+            </w:r>
+            <w:r>
+              <w:rPr>
+                <w:rFonts w:ascii="Arial" w:hAnsi="Arial" w:eastAsia="Alibaba PuHuiTi B" w:cs="Arial"/>
+                <w:b/>
+                <w:i w:val="0"/>
+                <w:color w:val="141414"/>
+                <w:sz w:val="21"/>
+              </w:rPr>
+              <w:t>流程标准：</w:t>
+            </w:r>
+            <w:r>
+              <w:rPr>
+                <w:rFonts w:ascii="Arial" w:hAnsi="Arial" w:eastAsia="Alibaba PuHuiTi R" w:cs="Arial"/>
+                <w:b w:val="0"/>
+                <w:i w:val="0"/>
+                <w:color w:val="141414"/>
+                <w:sz w:val="21"/>
+              </w:rPr>
+              <w:t>梳理渲染制作流程与图片质量标准，形成天津武清地毯行业的图像生产方法，相关方法仍被原团队沿用。</w:t>
             </w:r>
           </w:p>
         </w:tc>

</xml_diff>